<commit_message>
Add Alpha Strike campaign rules
</commit_message>
<xml_diff>
--- a/docs/Historical_Battle_of_Tukayyid_Campaign_Rules.docx
+++ b/docs/Historical_Battle_of_Tukayyid_Campaign_Rules.docx
@@ -63,7 +63,7 @@
         <w:jc w:val="center"/>
       </w:pPr>
       <w:r>
-        <w:t>Only changed or additional rules are presented below. Unless specifically stated otherwise, continue using the published Battle of Tukayyid and Hot Spots: Draconis Reach rules, together with either the BattleTech Core Rulebook or Total Warfare and BattleTech: Mercenaries.</w:t>
+        <w:t>Only changed or additional rules are presented below. Unless specifically stated otherwise, continue using the published Battle of Tukayyid and Hot Spots: Draconis Reach rules, together with the rules publication selected below.</w:t>
       </w:r>
     </w:p>
     <w:p>
@@ -209,7 +209,7 @@
               <w:spacing w:after="0"/>
             </w:pPr>
             <w:r>
-              <w:t>New core rules</w:t>
+              <w:t>Classic - new core rules</w:t>
             </w:r>
           </w:p>
         </w:tc>
@@ -254,7 +254,7 @@
               <w:spacing w:after="0"/>
             </w:pPr>
             <w:r>
-              <w:t>Alternative older rules</w:t>
+              <w:t>Classic - alternative older rules</w:t>
             </w:r>
           </w:p>
         </w:tc>
@@ -299,7 +299,52 @@
               <w:spacing w:after="0"/>
             </w:pPr>
             <w:r>
-              <w:t>Required with either path</w:t>
+              <w:t>Alpha Strike</w:t>
+            </w:r>
+          </w:p>
+        </w:tc>
+        <w:tc>
+          <w:tcPr>
+            <w:tcW w:type="dxa" w:w="6614"/>
+            <w:tcMar>
+              <w:top w:w="80" w:type="dxa"/>
+              <w:start w:w="120" w:type="dxa"/>
+              <w:bottom w:w="80" w:type="dxa"/>
+              <w:end w:w="120" w:type="dxa"/>
+            </w:tcMar>
+            <w:vAlign w:val="top"/>
+          </w:tcPr>
+          <w:p>
+            <w:pPr>
+              <w:spacing w:after="0"/>
+            </w:pPr>
+            <w:r>
+              <w:t>Alpha Strike: Commander's Edition</w:t>
+            </w:r>
+          </w:p>
+        </w:tc>
+      </w:tr>
+      <w:tr>
+        <w:trPr>
+          <w:cantSplit/>
+        </w:trPr>
+        <w:tc>
+          <w:tcPr>
+            <w:tcW w:type="dxa" w:w="3426"/>
+            <w:tcMar>
+              <w:top w:w="80" w:type="dxa"/>
+              <w:start w:w="120" w:type="dxa"/>
+              <w:bottom w:w="80" w:type="dxa"/>
+              <w:end w:w="120" w:type="dxa"/>
+            </w:tcMar>
+            <w:vAlign w:val="top"/>
+          </w:tcPr>
+          <w:p>
+            <w:pPr>
+              <w:spacing w:after="0"/>
+            </w:pPr>
+            <w:r>
+              <w:t>Required with every path</w:t>
             </w:r>
           </w:p>
         </w:tc>
@@ -339,7 +384,7 @@
         <w:t xml:space="preserve">Using These Rules. </w:t>
       </w:r>
       <w:r>
-        <w:t>This document changes, replaces, or adds to the published campaign rules. Use either the BattleTech Core Rulebook or the combination of Total Warfare and BattleTech: Mercenaries for the core game and Battlefield Support rules. Battle of Tukayyid and Hot Spots: Draconis Reach are required with either rules path. Any applicable published rule not addressed here remains in effect.</w:t>
+        <w:t>This document changes, replaces, or adds to the published campaign rules. For Classic BattleTech, use either the BattleTech Core Rulebook or the combination of Total Warfare and BattleTech: Mercenaries. For Alpha Strike, use Alpha Strike: Commander's Edition. Battle of Tukayyid and Hot Spots: Draconis Reach are required with every rules path. Any applicable published rule not addressed here remains in effect.</w:t>
       </w:r>
     </w:p>
     <w:p>
@@ -423,7 +468,7 @@
         <w:pStyle w:val="Heading2"/>
       </w:pPr>
       <w:r>
-        <w:t>Campaign Scale and Battle Value</w:t>
+        <w:t>Campaign Scale</w:t>
       </w:r>
     </w:p>
     <w:tbl>
@@ -879,6 +924,459 @@
         <w:spacing w:after="40"/>
       </w:pPr>
     </w:p>
+    <w:tbl>
+      <w:tblPr>
+        <w:tblStyle w:val="TableGrid"/>
+        <w:tblW w:type="dxa" w:w="10040"/>
+        <w:jc w:val="left"/>
+        <w:tblLayout w:type="fixed"/>
+        <w:tblLook w:firstColumn="1" w:firstRow="1" w:lastColumn="0" w:lastRow="0" w:noHBand="0" w:noVBand="1" w:val="04A0"/>
+        <w:tblInd w:type="dxa" w:w="120"/>
+        <w:tblLayout w:type="fixed"/>
+      </w:tblPr>
+      <w:tblGrid>
+        <w:gridCol w:w="2267"/>
+        <w:gridCol w:w="1943"/>
+        <w:gridCol w:w="1943"/>
+        <w:gridCol w:w="1943"/>
+        <w:gridCol w:w="1944"/>
+      </w:tblGrid>
+      <w:tr>
+        <w:trPr>
+          <w:tblHeader w:val="true"/>
+        </w:trPr>
+        <w:tc>
+          <w:tcPr>
+            <w:tcW w:type="dxa" w:w="2267"/>
+            <w:shd w:fill="DCE3EE"/>
+            <w:tcMar>
+              <w:top w:w="80" w:type="dxa"/>
+              <w:start w:w="120" w:type="dxa"/>
+              <w:bottom w:w="80" w:type="dxa"/>
+              <w:end w:w="120" w:type="dxa"/>
+            </w:tcMar>
+            <w:vAlign w:val="center"/>
+          </w:tcPr>
+          <w:p>
+            <w:r>
+              <w:rPr>
+                <w:b/>
+                <w:color w:val="213854"/>
+              </w:rPr>
+              <w:t>Campaign Size</w:t>
+            </w:r>
+          </w:p>
+        </w:tc>
+        <w:tc>
+          <w:tcPr>
+            <w:tcW w:type="dxa" w:w="1943"/>
+            <w:shd w:fill="DCE3EE"/>
+            <w:tcMar>
+              <w:top w:w="80" w:type="dxa"/>
+              <w:start w:w="120" w:type="dxa"/>
+              <w:bottom w:w="80" w:type="dxa"/>
+              <w:end w:w="120" w:type="dxa"/>
+            </w:tcMar>
+            <w:vAlign w:val="center"/>
+          </w:tcPr>
+          <w:p>
+            <w:r>
+              <w:rPr>
+                <w:b/>
+                <w:color w:val="213854"/>
+              </w:rPr>
+              <w:t>Campaign PV</w:t>
+            </w:r>
+          </w:p>
+        </w:tc>
+        <w:tc>
+          <w:tcPr>
+            <w:tcW w:type="dxa" w:w="1943"/>
+            <w:shd w:fill="DCE3EE"/>
+            <w:tcMar>
+              <w:top w:w="80" w:type="dxa"/>
+              <w:start w:w="120" w:type="dxa"/>
+              <w:bottom w:w="80" w:type="dxa"/>
+              <w:end w:w="120" w:type="dxa"/>
+            </w:tcMar>
+            <w:vAlign w:val="center"/>
+          </w:tcPr>
+          <w:p>
+            <w:r>
+              <w:rPr>
+                <w:b/>
+                <w:color w:val="213854"/>
+              </w:rPr>
+              <w:t>33%</w:t>
+            </w:r>
+          </w:p>
+        </w:tc>
+        <w:tc>
+          <w:tcPr>
+            <w:tcW w:type="dxa" w:w="1943"/>
+            <w:shd w:fill="DCE3EE"/>
+            <w:tcMar>
+              <w:top w:w="80" w:type="dxa"/>
+              <w:start w:w="120" w:type="dxa"/>
+              <w:bottom w:w="80" w:type="dxa"/>
+              <w:end w:w="120" w:type="dxa"/>
+            </w:tcMar>
+            <w:vAlign w:val="center"/>
+          </w:tcPr>
+          <w:p>
+            <w:r>
+              <w:rPr>
+                <w:b/>
+                <w:color w:val="213854"/>
+              </w:rPr>
+              <w:t>25%</w:t>
+            </w:r>
+          </w:p>
+        </w:tc>
+        <w:tc>
+          <w:tcPr>
+            <w:tcW w:type="dxa" w:w="1944"/>
+            <w:shd w:fill="DCE3EE"/>
+            <w:tcMar>
+              <w:top w:w="80" w:type="dxa"/>
+              <w:start w:w="120" w:type="dxa"/>
+              <w:bottom w:w="80" w:type="dxa"/>
+              <w:end w:w="120" w:type="dxa"/>
+            </w:tcMar>
+            <w:vAlign w:val="center"/>
+          </w:tcPr>
+          <w:p>
+            <w:r>
+              <w:rPr>
+                <w:b/>
+                <w:color w:val="213854"/>
+              </w:rPr>
+              <w:t>50%</w:t>
+            </w:r>
+          </w:p>
+        </w:tc>
+      </w:tr>
+      <w:tr>
+        <w:trPr>
+          <w:cantSplit/>
+        </w:trPr>
+        <w:tc>
+          <w:tcPr>
+            <w:tcW w:type="dxa" w:w="2267"/>
+            <w:tcMar>
+              <w:top w:w="80" w:type="dxa"/>
+              <w:start w:w="120" w:type="dxa"/>
+              <w:bottom w:w="80" w:type="dxa"/>
+              <w:end w:w="120" w:type="dxa"/>
+            </w:tcMar>
+            <w:vAlign w:val="top"/>
+          </w:tcPr>
+          <w:p>
+            <w:pPr>
+              <w:spacing w:after="0"/>
+            </w:pPr>
+            <w:r>
+              <w:t>Star</w:t>
+            </w:r>
+          </w:p>
+        </w:tc>
+        <w:tc>
+          <w:tcPr>
+            <w:tcW w:type="dxa" w:w="1943"/>
+            <w:tcMar>
+              <w:top w:w="80" w:type="dxa"/>
+              <w:start w:w="120" w:type="dxa"/>
+              <w:bottom w:w="80" w:type="dxa"/>
+              <w:end w:w="120" w:type="dxa"/>
+            </w:tcMar>
+            <w:vAlign w:val="top"/>
+          </w:tcPr>
+          <w:p>
+            <w:pPr>
+              <w:spacing w:after="0"/>
+            </w:pPr>
+            <w:r>
+              <w:t>600</w:t>
+            </w:r>
+          </w:p>
+        </w:tc>
+        <w:tc>
+          <w:tcPr>
+            <w:tcW w:type="dxa" w:w="1943"/>
+            <w:tcMar>
+              <w:top w:w="80" w:type="dxa"/>
+              <w:start w:w="120" w:type="dxa"/>
+              <w:bottom w:w="80" w:type="dxa"/>
+              <w:end w:w="120" w:type="dxa"/>
+            </w:tcMar>
+            <w:vAlign w:val="top"/>
+          </w:tcPr>
+          <w:p>
+            <w:pPr>
+              <w:spacing w:after="0"/>
+            </w:pPr>
+            <w:r>
+              <w:t>198</w:t>
+            </w:r>
+          </w:p>
+        </w:tc>
+        <w:tc>
+          <w:tcPr>
+            <w:tcW w:type="dxa" w:w="1943"/>
+            <w:tcMar>
+              <w:top w:w="80" w:type="dxa"/>
+              <w:start w:w="120" w:type="dxa"/>
+              <w:bottom w:w="80" w:type="dxa"/>
+              <w:end w:w="120" w:type="dxa"/>
+            </w:tcMar>
+            <w:vAlign w:val="top"/>
+          </w:tcPr>
+          <w:p>
+            <w:pPr>
+              <w:spacing w:after="0"/>
+            </w:pPr>
+            <w:r>
+              <w:t>150</w:t>
+            </w:r>
+          </w:p>
+        </w:tc>
+        <w:tc>
+          <w:tcPr>
+            <w:tcW w:type="dxa" w:w="1944"/>
+            <w:tcMar>
+              <w:top w:w="80" w:type="dxa"/>
+              <w:start w:w="120" w:type="dxa"/>
+              <w:bottom w:w="80" w:type="dxa"/>
+              <w:end w:w="120" w:type="dxa"/>
+            </w:tcMar>
+            <w:vAlign w:val="top"/>
+          </w:tcPr>
+          <w:p>
+            <w:pPr>
+              <w:spacing w:after="0"/>
+            </w:pPr>
+            <w:r>
+              <w:t>300</w:t>
+            </w:r>
+          </w:p>
+        </w:tc>
+      </w:tr>
+      <w:tr>
+        <w:trPr>
+          <w:cantSplit/>
+        </w:trPr>
+        <w:tc>
+          <w:tcPr>
+            <w:tcW w:type="dxa" w:w="2267"/>
+            <w:tcMar>
+              <w:top w:w="80" w:type="dxa"/>
+              <w:start w:w="120" w:type="dxa"/>
+              <w:bottom w:w="80" w:type="dxa"/>
+              <w:end w:w="120" w:type="dxa"/>
+            </w:tcMar>
+            <w:vAlign w:val="top"/>
+          </w:tcPr>
+          <w:p>
+            <w:pPr>
+              <w:spacing w:after="0"/>
+            </w:pPr>
+            <w:r>
+              <w:t>Binary</w:t>
+            </w:r>
+          </w:p>
+        </w:tc>
+        <w:tc>
+          <w:tcPr>
+            <w:tcW w:type="dxa" w:w="1943"/>
+            <w:tcMar>
+              <w:top w:w="80" w:type="dxa"/>
+              <w:start w:w="120" w:type="dxa"/>
+              <w:bottom w:w="80" w:type="dxa"/>
+              <w:end w:w="120" w:type="dxa"/>
+            </w:tcMar>
+            <w:vAlign w:val="top"/>
+          </w:tcPr>
+          <w:p>
+            <w:pPr>
+              <w:spacing w:after="0"/>
+            </w:pPr>
+            <w:r>
+              <w:t>1,200</w:t>
+            </w:r>
+          </w:p>
+        </w:tc>
+        <w:tc>
+          <w:tcPr>
+            <w:tcW w:type="dxa" w:w="1943"/>
+            <w:tcMar>
+              <w:top w:w="80" w:type="dxa"/>
+              <w:start w:w="120" w:type="dxa"/>
+              <w:bottom w:w="80" w:type="dxa"/>
+              <w:end w:w="120" w:type="dxa"/>
+            </w:tcMar>
+            <w:vAlign w:val="top"/>
+          </w:tcPr>
+          <w:p>
+            <w:pPr>
+              <w:spacing w:after="0"/>
+            </w:pPr>
+            <w:r>
+              <w:t>396</w:t>
+            </w:r>
+          </w:p>
+        </w:tc>
+        <w:tc>
+          <w:tcPr>
+            <w:tcW w:type="dxa" w:w="1943"/>
+            <w:tcMar>
+              <w:top w:w="80" w:type="dxa"/>
+              <w:start w:w="120" w:type="dxa"/>
+              <w:bottom w:w="80" w:type="dxa"/>
+              <w:end w:w="120" w:type="dxa"/>
+            </w:tcMar>
+            <w:vAlign w:val="top"/>
+          </w:tcPr>
+          <w:p>
+            <w:pPr>
+              <w:spacing w:after="0"/>
+            </w:pPr>
+            <w:r>
+              <w:t>300</w:t>
+            </w:r>
+          </w:p>
+        </w:tc>
+        <w:tc>
+          <w:tcPr>
+            <w:tcW w:type="dxa" w:w="1944"/>
+            <w:tcMar>
+              <w:top w:w="80" w:type="dxa"/>
+              <w:start w:w="120" w:type="dxa"/>
+              <w:bottom w:w="80" w:type="dxa"/>
+              <w:end w:w="120" w:type="dxa"/>
+            </w:tcMar>
+            <w:vAlign w:val="top"/>
+          </w:tcPr>
+          <w:p>
+            <w:pPr>
+              <w:spacing w:after="0"/>
+            </w:pPr>
+            <w:r>
+              <w:t>600</w:t>
+            </w:r>
+          </w:p>
+        </w:tc>
+      </w:tr>
+      <w:tr>
+        <w:trPr>
+          <w:cantSplit/>
+        </w:trPr>
+        <w:tc>
+          <w:tcPr>
+            <w:tcW w:type="dxa" w:w="2267"/>
+            <w:tcMar>
+              <w:top w:w="80" w:type="dxa"/>
+              <w:start w:w="120" w:type="dxa"/>
+              <w:bottom w:w="80" w:type="dxa"/>
+              <w:end w:w="120" w:type="dxa"/>
+            </w:tcMar>
+            <w:vAlign w:val="top"/>
+          </w:tcPr>
+          <w:p>
+            <w:pPr>
+              <w:spacing w:after="0"/>
+            </w:pPr>
+            <w:r>
+              <w:t>Trinary</w:t>
+            </w:r>
+          </w:p>
+        </w:tc>
+        <w:tc>
+          <w:tcPr>
+            <w:tcW w:type="dxa" w:w="1943"/>
+            <w:tcMar>
+              <w:top w:w="80" w:type="dxa"/>
+              <w:start w:w="120" w:type="dxa"/>
+              <w:bottom w:w="80" w:type="dxa"/>
+              <w:end w:w="120" w:type="dxa"/>
+            </w:tcMar>
+            <w:vAlign w:val="top"/>
+          </w:tcPr>
+          <w:p>
+            <w:pPr>
+              <w:spacing w:after="0"/>
+            </w:pPr>
+            <w:r>
+              <w:t>1,800</w:t>
+            </w:r>
+          </w:p>
+        </w:tc>
+        <w:tc>
+          <w:tcPr>
+            <w:tcW w:type="dxa" w:w="1943"/>
+            <w:tcMar>
+              <w:top w:w="80" w:type="dxa"/>
+              <w:start w:w="120" w:type="dxa"/>
+              <w:bottom w:w="80" w:type="dxa"/>
+              <w:end w:w="120" w:type="dxa"/>
+            </w:tcMar>
+            <w:vAlign w:val="top"/>
+          </w:tcPr>
+          <w:p>
+            <w:pPr>
+              <w:spacing w:after="0"/>
+            </w:pPr>
+            <w:r>
+              <w:t>594</w:t>
+            </w:r>
+          </w:p>
+        </w:tc>
+        <w:tc>
+          <w:tcPr>
+            <w:tcW w:type="dxa" w:w="1943"/>
+            <w:tcMar>
+              <w:top w:w="80" w:type="dxa"/>
+              <w:start w:w="120" w:type="dxa"/>
+              <w:bottom w:w="80" w:type="dxa"/>
+              <w:end w:w="120" w:type="dxa"/>
+            </w:tcMar>
+            <w:vAlign w:val="top"/>
+          </w:tcPr>
+          <w:p>
+            <w:pPr>
+              <w:spacing w:after="0"/>
+            </w:pPr>
+            <w:r>
+              <w:t>450</w:t>
+            </w:r>
+          </w:p>
+        </w:tc>
+        <w:tc>
+          <w:tcPr>
+            <w:tcW w:type="dxa" w:w="1944"/>
+            <w:tcMar>
+              <w:top w:w="80" w:type="dxa"/>
+              <w:start w:w="120" w:type="dxa"/>
+              <w:bottom w:w="80" w:type="dxa"/>
+              <w:end w:w="120" w:type="dxa"/>
+            </w:tcMar>
+            <w:vAlign w:val="top"/>
+          </w:tcPr>
+          <w:p>
+            <w:pPr>
+              <w:spacing w:after="0"/>
+            </w:pPr>
+            <w:r>
+              <w:t>900</w:t>
+            </w:r>
+          </w:p>
+        </w:tc>
+      </w:tr>
+    </w:tbl>
+    <w:p>
+      <w:pPr>
+        <w:spacing w:after="40"/>
+      </w:pPr>
+    </w:p>
     <w:p>
       <w:r>
         <w:rPr>
@@ -887,7 +1385,7 @@
         <w:t xml:space="preserve">Fixed Denominator. </w:t>
       </w:r>
       <w:r>
-        <w:t>All Track percentages use the original Campaign BV allowance shown above. Losses, repairs, and replacements do not change that denominator.</w:t>
+        <w:t>All Track percentages use the original Campaign BV or PV allowance shown above. Losses, repairs, and replacements do not change that denominator.</w:t>
       </w:r>
     </w:p>
     <w:p>
@@ -898,7 +1396,7 @@
         <w:t xml:space="preserve">Skill Adjustment. </w:t>
       </w:r>
       <w:r>
-        <w:t>Use the deployed pilot's actual skills when calculating a unit's BV.</w:t>
+        <w:t>Use the deployed pilot's actual skills when calculating a unit's BV or PV.</w:t>
       </w:r>
     </w:p>
     <w:p>
@@ -909,7 +1407,7 @@
         <w:t xml:space="preserve">Clan Advantage. </w:t>
       </w:r>
       <w:r>
-        <w:t>For Campaign Force construction and Track deployment limits only, treat each Clan pilot as one Experience Rating worse when accounting for BV. Actual skills do not change. This adjustment does not reduce SP purchase or repair costs.</w:t>
+        <w:t>For Campaign Force construction and Track deployment limits only, treat each Clan pilot as one Experience Rating worse when accounting for BV or one Skill rating worse when accounting for PV. Actual skills do not change. This adjustment does not reduce SP purchase or repair costs.</w:t>
       </w:r>
     </w:p>
     <w:p>
@@ -918,6 +1416,14 @@
       </w:pPr>
       <w:r>
         <w:t>Starting SP and Support Allocation</w:t>
+      </w:r>
+    </w:p>
+    <w:p>
+      <w:pPr>
+        <w:pStyle w:val="Heading3"/>
+      </w:pPr>
+      <w:r>
+        <w:t>Classic BattleTech Starting SP</w:t>
       </w:r>
     </w:p>
     <w:tbl>
@@ -1208,16 +1714,306 @@
       </w:pPr>
     </w:p>
     <w:p>
+      <w:pPr>
+        <w:pStyle w:val="Heading3"/>
+      </w:pPr>
       <w:r>
-        <w:br w:type="page"/>
+        <w:t>Alpha Strike Starting SP</w:t>
       </w:r>
+    </w:p>
+    <w:tbl>
+      <w:tblPr>
+        <w:tblStyle w:val="TableGrid"/>
+        <w:tblW w:type="dxa" w:w="10040"/>
+        <w:jc w:val="left"/>
+        <w:tblLayout w:type="fixed"/>
+        <w:tblLook w:firstColumn="1" w:firstRow="1" w:lastColumn="0" w:lastRow="0" w:noHBand="0" w:noVBand="1" w:val="04A0"/>
+        <w:tblInd w:type="dxa" w:w="120"/>
+        <w:tblLayout w:type="fixed"/>
+      </w:tblPr>
+      <w:tblGrid>
+        <w:gridCol w:w="3347"/>
+        <w:gridCol w:w="3347"/>
+        <w:gridCol w:w="3346"/>
+      </w:tblGrid>
+      <w:tr>
+        <w:trPr>
+          <w:tblHeader w:val="true"/>
+        </w:trPr>
+        <w:tc>
+          <w:tcPr>
+            <w:tcW w:type="dxa" w:w="3347"/>
+            <w:shd w:fill="DCE3EE"/>
+            <w:tcMar>
+              <w:top w:w="80" w:type="dxa"/>
+              <w:start w:w="120" w:type="dxa"/>
+              <w:bottom w:w="80" w:type="dxa"/>
+              <w:end w:w="120" w:type="dxa"/>
+            </w:tcMar>
+            <w:vAlign w:val="center"/>
+          </w:tcPr>
+          <w:p>
+            <w:r>
+              <w:rPr>
+                <w:b/>
+                <w:color w:val="213854"/>
+              </w:rPr>
+              <w:t>Campaign Size</w:t>
+            </w:r>
+          </w:p>
+        </w:tc>
+        <w:tc>
+          <w:tcPr>
+            <w:tcW w:type="dxa" w:w="3347"/>
+            <w:shd w:fill="DCE3EE"/>
+            <w:tcMar>
+              <w:top w:w="80" w:type="dxa"/>
+              <w:start w:w="120" w:type="dxa"/>
+              <w:bottom w:w="80" w:type="dxa"/>
+              <w:end w:w="120" w:type="dxa"/>
+            </w:tcMar>
+            <w:vAlign w:val="center"/>
+          </w:tcPr>
+          <w:p>
+            <w:r>
+              <w:rPr>
+                <w:b/>
+                <w:color w:val="213854"/>
+              </w:rPr>
+              <w:t>Clan Starting SP</w:t>
+            </w:r>
+          </w:p>
+        </w:tc>
+        <w:tc>
+          <w:tcPr>
+            <w:tcW w:type="dxa" w:w="3346"/>
+            <w:shd w:fill="DCE3EE"/>
+            <w:tcMar>
+              <w:top w:w="80" w:type="dxa"/>
+              <w:start w:w="120" w:type="dxa"/>
+              <w:bottom w:w="80" w:type="dxa"/>
+              <w:end w:w="120" w:type="dxa"/>
+            </w:tcMar>
+            <w:vAlign w:val="center"/>
+          </w:tcPr>
+          <w:p>
+            <w:r>
+              <w:rPr>
+                <w:b/>
+                <w:color w:val="213854"/>
+              </w:rPr>
+              <w:t>ComStar Starting SP</w:t>
+            </w:r>
+          </w:p>
+        </w:tc>
+      </w:tr>
+      <w:tr>
+        <w:trPr>
+          <w:cantSplit/>
+        </w:trPr>
+        <w:tc>
+          <w:tcPr>
+            <w:tcW w:type="dxa" w:w="3347"/>
+            <w:tcMar>
+              <w:top w:w="80" w:type="dxa"/>
+              <w:start w:w="120" w:type="dxa"/>
+              <w:bottom w:w="80" w:type="dxa"/>
+              <w:end w:w="120" w:type="dxa"/>
+            </w:tcMar>
+            <w:vAlign w:val="top"/>
+          </w:tcPr>
+          <w:p>
+            <w:pPr>
+              <w:spacing w:after="0"/>
+            </w:pPr>
+            <w:r>
+              <w:t>Star</w:t>
+            </w:r>
+          </w:p>
+        </w:tc>
+        <w:tc>
+          <w:tcPr>
+            <w:tcW w:type="dxa" w:w="3347"/>
+            <w:tcMar>
+              <w:top w:w="80" w:type="dxa"/>
+              <w:start w:w="120" w:type="dxa"/>
+              <w:bottom w:w="80" w:type="dxa"/>
+              <w:end w:w="120" w:type="dxa"/>
+            </w:tcMar>
+            <w:vAlign w:val="top"/>
+          </w:tcPr>
+          <w:p>
+            <w:pPr>
+              <w:spacing w:after="0"/>
+            </w:pPr>
+            <w:r>
+              <w:t>7,920</w:t>
+            </w:r>
+          </w:p>
+        </w:tc>
+        <w:tc>
+          <w:tcPr>
+            <w:tcW w:type="dxa" w:w="3346"/>
+            <w:tcMar>
+              <w:top w:w="80" w:type="dxa"/>
+              <w:start w:w="120" w:type="dxa"/>
+              <w:bottom w:w="80" w:type="dxa"/>
+              <w:end w:w="120" w:type="dxa"/>
+            </w:tcMar>
+            <w:vAlign w:val="top"/>
+          </w:tcPr>
+          <w:p>
+            <w:pPr>
+              <w:spacing w:after="0"/>
+            </w:pPr>
+            <w:r>
+              <w:t>15,840</w:t>
+            </w:r>
+          </w:p>
+        </w:tc>
+      </w:tr>
+      <w:tr>
+        <w:trPr>
+          <w:cantSplit/>
+        </w:trPr>
+        <w:tc>
+          <w:tcPr>
+            <w:tcW w:type="dxa" w:w="3347"/>
+            <w:tcMar>
+              <w:top w:w="80" w:type="dxa"/>
+              <w:start w:w="120" w:type="dxa"/>
+              <w:bottom w:w="80" w:type="dxa"/>
+              <w:end w:w="120" w:type="dxa"/>
+            </w:tcMar>
+            <w:vAlign w:val="top"/>
+          </w:tcPr>
+          <w:p>
+            <w:pPr>
+              <w:spacing w:after="0"/>
+            </w:pPr>
+            <w:r>
+              <w:t>Binary</w:t>
+            </w:r>
+          </w:p>
+        </w:tc>
+        <w:tc>
+          <w:tcPr>
+            <w:tcW w:type="dxa" w:w="3347"/>
+            <w:tcMar>
+              <w:top w:w="80" w:type="dxa"/>
+              <w:start w:w="120" w:type="dxa"/>
+              <w:bottom w:w="80" w:type="dxa"/>
+              <w:end w:w="120" w:type="dxa"/>
+            </w:tcMar>
+            <w:vAlign w:val="top"/>
+          </w:tcPr>
+          <w:p>
+            <w:pPr>
+              <w:spacing w:after="0"/>
+            </w:pPr>
+            <w:r>
+              <w:t>15,840</w:t>
+            </w:r>
+          </w:p>
+        </w:tc>
+        <w:tc>
+          <w:tcPr>
+            <w:tcW w:type="dxa" w:w="3346"/>
+            <w:tcMar>
+              <w:top w:w="80" w:type="dxa"/>
+              <w:start w:w="120" w:type="dxa"/>
+              <w:bottom w:w="80" w:type="dxa"/>
+              <w:end w:w="120" w:type="dxa"/>
+            </w:tcMar>
+            <w:vAlign w:val="top"/>
+          </w:tcPr>
+          <w:p>
+            <w:pPr>
+              <w:spacing w:after="0"/>
+            </w:pPr>
+            <w:r>
+              <w:t>31,680</w:t>
+            </w:r>
+          </w:p>
+        </w:tc>
+      </w:tr>
+      <w:tr>
+        <w:trPr>
+          <w:cantSplit/>
+        </w:trPr>
+        <w:tc>
+          <w:tcPr>
+            <w:tcW w:type="dxa" w:w="3347"/>
+            <w:tcMar>
+              <w:top w:w="80" w:type="dxa"/>
+              <w:start w:w="120" w:type="dxa"/>
+              <w:bottom w:w="80" w:type="dxa"/>
+              <w:end w:w="120" w:type="dxa"/>
+            </w:tcMar>
+            <w:vAlign w:val="top"/>
+          </w:tcPr>
+          <w:p>
+            <w:pPr>
+              <w:spacing w:after="0"/>
+            </w:pPr>
+            <w:r>
+              <w:t>Trinary</w:t>
+            </w:r>
+          </w:p>
+        </w:tc>
+        <w:tc>
+          <w:tcPr>
+            <w:tcW w:type="dxa" w:w="3347"/>
+            <w:tcMar>
+              <w:top w:w="80" w:type="dxa"/>
+              <w:start w:w="120" w:type="dxa"/>
+              <w:bottom w:w="80" w:type="dxa"/>
+              <w:end w:w="120" w:type="dxa"/>
+            </w:tcMar>
+            <w:vAlign w:val="top"/>
+          </w:tcPr>
+          <w:p>
+            <w:pPr>
+              <w:spacing w:after="0"/>
+            </w:pPr>
+            <w:r>
+              <w:t>23,760</w:t>
+            </w:r>
+          </w:p>
+        </w:tc>
+        <w:tc>
+          <w:tcPr>
+            <w:tcW w:type="dxa" w:w="3346"/>
+            <w:tcMar>
+              <w:top w:w="80" w:type="dxa"/>
+              <w:start w:w="120" w:type="dxa"/>
+              <w:bottom w:w="80" w:type="dxa"/>
+              <w:end w:w="120" w:type="dxa"/>
+            </w:tcMar>
+            <w:vAlign w:val="top"/>
+          </w:tcPr>
+          <w:p>
+            <w:pPr>
+              <w:spacing w:after="0"/>
+            </w:pPr>
+            <w:r>
+              <w:t>47,520</w:t>
+            </w:r>
+          </w:p>
+        </w:tc>
+      </w:tr>
+    </w:tbl>
+    <w:p>
+      <w:pPr>
+        <w:spacing w:after="40"/>
+      </w:pPr>
     </w:p>
     <w:p>
       <w:pPr>
         <w:pStyle w:val="Heading2"/>
       </w:pPr>
       <w:r>
-        <w:t>Support Allocation</w:t>
+        <w:t>Classic BattleTech Support Allocation</w:t>
       </w:r>
     </w:p>
     <w:tbl>
@@ -1592,6 +2388,395 @@
     </w:p>
     <w:p>
       <w:pPr>
+        <w:pStyle w:val="Heading2"/>
+      </w:pPr>
+      <w:r>
+        <w:t>Alpha Strike Support Allocation</w:t>
+      </w:r>
+    </w:p>
+    <w:tbl>
+      <w:tblPr>
+        <w:tblStyle w:val="TableGrid"/>
+        <w:tblW w:type="dxa" w:w="10040"/>
+        <w:jc w:val="left"/>
+        <w:tblLayout w:type="fixed"/>
+        <w:tblLook w:firstColumn="1" w:firstRow="1" w:lastColumn="0" w:lastRow="0" w:noHBand="0" w:noVBand="1" w:val="04A0"/>
+        <w:tblInd w:type="dxa" w:w="120"/>
+        <w:tblLayout w:type="fixed"/>
+      </w:tblPr>
+      <w:tblGrid>
+        <w:gridCol w:w="1513"/>
+        <w:gridCol w:w="3026"/>
+        <w:gridCol w:w="2751"/>
+        <w:gridCol w:w="2750"/>
+      </w:tblGrid>
+      <w:tr>
+        <w:trPr>
+          <w:tblHeader w:val="true"/>
+        </w:trPr>
+        <w:tc>
+          <w:tcPr>
+            <w:tcW w:type="dxa" w:w="1513"/>
+            <w:shd w:fill="DCE3EE"/>
+            <w:tcMar>
+              <w:top w:w="80" w:type="dxa"/>
+              <w:start w:w="120" w:type="dxa"/>
+              <w:bottom w:w="80" w:type="dxa"/>
+              <w:end w:w="120" w:type="dxa"/>
+            </w:tcMar>
+            <w:vAlign w:val="center"/>
+          </w:tcPr>
+          <w:p>
+            <w:r>
+              <w:rPr>
+                <w:b/>
+                <w:color w:val="213854"/>
+              </w:rPr>
+              <w:t>Campaign Size</w:t>
+            </w:r>
+          </w:p>
+        </w:tc>
+        <w:tc>
+          <w:tcPr>
+            <w:tcW w:type="dxa" w:w="3026"/>
+            <w:shd w:fill="DCE3EE"/>
+            <w:tcMar>
+              <w:top w:w="80" w:type="dxa"/>
+              <w:start w:w="120" w:type="dxa"/>
+              <w:bottom w:w="80" w:type="dxa"/>
+              <w:end w:w="120" w:type="dxa"/>
+            </w:tcMar>
+            <w:vAlign w:val="center"/>
+          </w:tcPr>
+          <w:p>
+            <w:r>
+              <w:rPr>
+                <w:b/>
+                <w:color w:val="213854"/>
+              </w:rPr>
+              <w:t>Result</w:t>
+            </w:r>
+          </w:p>
+        </w:tc>
+        <w:tc>
+          <w:tcPr>
+            <w:tcW w:type="dxa" w:w="2751"/>
+            <w:shd w:fill="DCE3EE"/>
+            <w:tcMar>
+              <w:top w:w="80" w:type="dxa"/>
+              <w:start w:w="120" w:type="dxa"/>
+              <w:bottom w:w="80" w:type="dxa"/>
+              <w:end w:w="120" w:type="dxa"/>
+            </w:tcMar>
+            <w:vAlign w:val="center"/>
+          </w:tcPr>
+          <w:p>
+            <w:r>
+              <w:rPr>
+                <w:b/>
+                <w:color w:val="213854"/>
+              </w:rPr>
+              <w:t>Clan</w:t>
+            </w:r>
+          </w:p>
+        </w:tc>
+        <w:tc>
+          <w:tcPr>
+            <w:tcW w:type="dxa" w:w="2750"/>
+            <w:shd w:fill="DCE3EE"/>
+            <w:tcMar>
+              <w:top w:w="80" w:type="dxa"/>
+              <w:start w:w="120" w:type="dxa"/>
+              <w:bottom w:w="80" w:type="dxa"/>
+              <w:end w:w="120" w:type="dxa"/>
+            </w:tcMar>
+            <w:vAlign w:val="center"/>
+          </w:tcPr>
+          <w:p>
+            <w:r>
+              <w:rPr>
+                <w:b/>
+                <w:color w:val="213854"/>
+              </w:rPr>
+              <w:t>ComStar</w:t>
+            </w:r>
+          </w:p>
+        </w:tc>
+      </w:tr>
+      <w:tr>
+        <w:trPr>
+          <w:cantSplit/>
+        </w:trPr>
+        <w:tc>
+          <w:tcPr>
+            <w:tcW w:type="dxa" w:w="1513"/>
+            <w:tcMar>
+              <w:top w:w="80" w:type="dxa"/>
+              <w:start w:w="120" w:type="dxa"/>
+              <w:bottom w:w="80" w:type="dxa"/>
+              <w:end w:w="120" w:type="dxa"/>
+            </w:tcMar>
+            <w:vAlign w:val="top"/>
+          </w:tcPr>
+          <w:p>
+            <w:pPr>
+              <w:spacing w:after="0"/>
+            </w:pPr>
+            <w:r>
+              <w:t>Star</w:t>
+            </w:r>
+          </w:p>
+        </w:tc>
+        <w:tc>
+          <w:tcPr>
+            <w:tcW w:type="dxa" w:w="3026"/>
+            <w:tcMar>
+              <w:top w:w="80" w:type="dxa"/>
+              <w:start w:w="120" w:type="dxa"/>
+              <w:bottom w:w="80" w:type="dxa"/>
+              <w:end w:w="120" w:type="dxa"/>
+            </w:tcMar>
+            <w:vAlign w:val="top"/>
+          </w:tcPr>
+          <w:p>
+            <w:pPr>
+              <w:spacing w:after="0"/>
+            </w:pPr>
+            <w:r>
+              <w:t>Unsuccessful / Successful / Complete</w:t>
+            </w:r>
+          </w:p>
+        </w:tc>
+        <w:tc>
+          <w:tcPr>
+            <w:tcW w:type="dxa" w:w="2751"/>
+            <w:tcMar>
+              <w:top w:w="80" w:type="dxa"/>
+              <w:start w:w="120" w:type="dxa"/>
+              <w:bottom w:w="80" w:type="dxa"/>
+              <w:end w:w="120" w:type="dxa"/>
+            </w:tcMar>
+            <w:vAlign w:val="top"/>
+          </w:tcPr>
+          <w:p>
+            <w:pPr>
+              <w:spacing w:after="0"/>
+            </w:pPr>
+            <w:r>
+              <w:t>660 / 1,320 / 1,980</w:t>
+            </w:r>
+          </w:p>
+        </w:tc>
+        <w:tc>
+          <w:tcPr>
+            <w:tcW w:type="dxa" w:w="2750"/>
+            <w:tcMar>
+              <w:top w:w="80" w:type="dxa"/>
+              <w:start w:w="120" w:type="dxa"/>
+              <w:bottom w:w="80" w:type="dxa"/>
+              <w:end w:w="120" w:type="dxa"/>
+            </w:tcMar>
+            <w:vAlign w:val="top"/>
+          </w:tcPr>
+          <w:p>
+            <w:pPr>
+              <w:spacing w:after="0"/>
+            </w:pPr>
+            <w:r>
+              <w:t>1,320 / 2,640 / 3,960</w:t>
+            </w:r>
+          </w:p>
+        </w:tc>
+      </w:tr>
+      <w:tr>
+        <w:trPr>
+          <w:cantSplit/>
+        </w:trPr>
+        <w:tc>
+          <w:tcPr>
+            <w:tcW w:type="dxa" w:w="1513"/>
+            <w:tcMar>
+              <w:top w:w="80" w:type="dxa"/>
+              <w:start w:w="120" w:type="dxa"/>
+              <w:bottom w:w="80" w:type="dxa"/>
+              <w:end w:w="120" w:type="dxa"/>
+            </w:tcMar>
+            <w:vAlign w:val="top"/>
+          </w:tcPr>
+          <w:p>
+            <w:pPr>
+              <w:spacing w:after="0"/>
+            </w:pPr>
+            <w:r>
+              <w:t>Binary</w:t>
+            </w:r>
+          </w:p>
+        </w:tc>
+        <w:tc>
+          <w:tcPr>
+            <w:tcW w:type="dxa" w:w="3026"/>
+            <w:tcMar>
+              <w:top w:w="80" w:type="dxa"/>
+              <w:start w:w="120" w:type="dxa"/>
+              <w:bottom w:w="80" w:type="dxa"/>
+              <w:end w:w="120" w:type="dxa"/>
+            </w:tcMar>
+            <w:vAlign w:val="top"/>
+          </w:tcPr>
+          <w:p>
+            <w:pPr>
+              <w:spacing w:after="0"/>
+            </w:pPr>
+            <w:r>
+              <w:t>Unsuccessful / Successful / Complete</w:t>
+            </w:r>
+          </w:p>
+        </w:tc>
+        <w:tc>
+          <w:tcPr>
+            <w:tcW w:type="dxa" w:w="2751"/>
+            <w:tcMar>
+              <w:top w:w="80" w:type="dxa"/>
+              <w:start w:w="120" w:type="dxa"/>
+              <w:bottom w:w="80" w:type="dxa"/>
+              <w:end w:w="120" w:type="dxa"/>
+            </w:tcMar>
+            <w:vAlign w:val="top"/>
+          </w:tcPr>
+          <w:p>
+            <w:pPr>
+              <w:spacing w:after="0"/>
+            </w:pPr>
+            <w:r>
+              <w:t>1,320 / 2,640 / 3,960</w:t>
+            </w:r>
+          </w:p>
+        </w:tc>
+        <w:tc>
+          <w:tcPr>
+            <w:tcW w:type="dxa" w:w="2750"/>
+            <w:tcMar>
+              <w:top w:w="80" w:type="dxa"/>
+              <w:start w:w="120" w:type="dxa"/>
+              <w:bottom w:w="80" w:type="dxa"/>
+              <w:end w:w="120" w:type="dxa"/>
+            </w:tcMar>
+            <w:vAlign w:val="top"/>
+          </w:tcPr>
+          <w:p>
+            <w:pPr>
+              <w:spacing w:after="0"/>
+            </w:pPr>
+            <w:r>
+              <w:t>2,640 / 5,280 / 7,920</w:t>
+            </w:r>
+          </w:p>
+        </w:tc>
+      </w:tr>
+      <w:tr>
+        <w:trPr>
+          <w:cantSplit/>
+        </w:trPr>
+        <w:tc>
+          <w:tcPr>
+            <w:tcW w:type="dxa" w:w="1513"/>
+            <w:tcMar>
+              <w:top w:w="80" w:type="dxa"/>
+              <w:start w:w="120" w:type="dxa"/>
+              <w:bottom w:w="80" w:type="dxa"/>
+              <w:end w:w="120" w:type="dxa"/>
+            </w:tcMar>
+            <w:vAlign w:val="top"/>
+          </w:tcPr>
+          <w:p>
+            <w:pPr>
+              <w:spacing w:after="0"/>
+            </w:pPr>
+            <w:r>
+              <w:t>Trinary</w:t>
+            </w:r>
+          </w:p>
+        </w:tc>
+        <w:tc>
+          <w:tcPr>
+            <w:tcW w:type="dxa" w:w="3026"/>
+            <w:tcMar>
+              <w:top w:w="80" w:type="dxa"/>
+              <w:start w:w="120" w:type="dxa"/>
+              <w:bottom w:w="80" w:type="dxa"/>
+              <w:end w:w="120" w:type="dxa"/>
+            </w:tcMar>
+            <w:vAlign w:val="top"/>
+          </w:tcPr>
+          <w:p>
+            <w:pPr>
+              <w:spacing w:after="0"/>
+            </w:pPr>
+            <w:r>
+              <w:t>Unsuccessful / Successful / Complete</w:t>
+            </w:r>
+          </w:p>
+        </w:tc>
+        <w:tc>
+          <w:tcPr>
+            <w:tcW w:type="dxa" w:w="2751"/>
+            <w:tcMar>
+              <w:top w:w="80" w:type="dxa"/>
+              <w:start w:w="120" w:type="dxa"/>
+              <w:bottom w:w="80" w:type="dxa"/>
+              <w:end w:w="120" w:type="dxa"/>
+            </w:tcMar>
+            <w:vAlign w:val="top"/>
+          </w:tcPr>
+          <w:p>
+            <w:pPr>
+              <w:spacing w:after="0"/>
+            </w:pPr>
+            <w:r>
+              <w:t>1,980 / 3,960 / 5,940</w:t>
+            </w:r>
+          </w:p>
+        </w:tc>
+        <w:tc>
+          <w:tcPr>
+            <w:tcW w:type="dxa" w:w="2750"/>
+            <w:tcMar>
+              <w:top w:w="80" w:type="dxa"/>
+              <w:start w:w="120" w:type="dxa"/>
+              <w:bottom w:w="80" w:type="dxa"/>
+              <w:end w:w="120" w:type="dxa"/>
+            </w:tcMar>
+            <w:vAlign w:val="top"/>
+          </w:tcPr>
+          <w:p>
+            <w:pPr>
+              <w:spacing w:after="0"/>
+            </w:pPr>
+            <w:r>
+              <w:t>3,960 / 7,920 / 11,880</w:t>
+            </w:r>
+          </w:p>
+        </w:tc>
+      </w:tr>
+    </w:tbl>
+    <w:p>
+      <w:pPr>
+        <w:spacing w:after="40"/>
+      </w:pPr>
+    </w:p>
+    <w:p>
+      <w:r>
+        <w:rPr>
+          <w:b/>
+        </w:rPr>
+        <w:t xml:space="preserve">Economic Scale. </w:t>
+      </w:r>
+      <w:r>
+        <w:t>The Alpha Strike amounts preserve the same percentage of total Campaign Force value and the same two-to-one ComStar logistical advantage as the Classic BattleTech amounts. Alpha Strike unit value is calculated at PV x 40 SP.</w:t>
+      </w:r>
+    </w:p>
+    <w:p>
+      <w:pPr>
         <w:pStyle w:val="ListBullet"/>
       </w:pPr>
       <w:r>
@@ -1686,8 +2871,9 @@
         <w:tblLayout w:type="fixed"/>
       </w:tblPr>
       <w:tblGrid>
-        <w:gridCol w:w="6052"/>
-        <w:gridCol w:w="3988"/>
+        <w:gridCol w:w="4126"/>
+        <w:gridCol w:w="2957"/>
+        <w:gridCol w:w="2957"/>
       </w:tblGrid>
       <w:tr>
         <w:trPr>
@@ -1695,7 +2881,7 @@
         </w:trPr>
         <w:tc>
           <w:tcPr>
-            <w:tcW w:type="dxa" w:w="6052"/>
+            <w:tcW w:type="dxa" w:w="4126"/>
             <w:shd w:fill="DCE3EE"/>
             <w:tcMar>
               <w:top w:w="80" w:type="dxa"/>
@@ -1717,7 +2903,7 @@
         </w:tc>
         <w:tc>
           <w:tcPr>
-            <w:tcW w:type="dxa" w:w="3988"/>
+            <w:tcW w:type="dxa" w:w="2957"/>
             <w:shd w:fill="DCE3EE"/>
             <w:tcMar>
               <w:top w:w="80" w:type="dxa"/>
@@ -1733,7 +2919,29 @@
                 <w:b/>
                 <w:color w:val="213854"/>
               </w:rPr>
-              <w:t>SP Cost</w:t>
+              <w:t>Classic BattleTech</w:t>
+            </w:r>
+          </w:p>
+        </w:tc>
+        <w:tc>
+          <w:tcPr>
+            <w:tcW w:type="dxa" w:w="2957"/>
+            <w:shd w:fill="DCE3EE"/>
+            <w:tcMar>
+              <w:top w:w="80" w:type="dxa"/>
+              <w:start w:w="120" w:type="dxa"/>
+              <w:bottom w:w="80" w:type="dxa"/>
+              <w:end w:w="120" w:type="dxa"/>
+            </w:tcMar>
+            <w:vAlign w:val="center"/>
+          </w:tcPr>
+          <w:p>
+            <w:r>
+              <w:rPr>
+                <w:b/>
+                <w:color w:val="213854"/>
+              </w:rPr>
+              <w:t>Alpha Strike</w:t>
             </w:r>
           </w:p>
         </w:tc>
@@ -1744,7 +2952,7 @@
         </w:trPr>
         <w:tc>
           <w:tcPr>
-            <w:tcW w:type="dxa" w:w="6052"/>
+            <w:tcW w:type="dxa" w:w="4126"/>
             <w:tcMar>
               <w:top w:w="80" w:type="dxa"/>
               <w:start w:w="120" w:type="dxa"/>
@@ -1764,7 +2972,7 @@
         </w:tc>
         <w:tc>
           <w:tcPr>
-            <w:tcW w:type="dxa" w:w="3988"/>
+            <w:tcW w:type="dxa" w:w="2957"/>
             <w:tcMar>
               <w:top w:w="80" w:type="dxa"/>
               <w:start w:w="120" w:type="dxa"/>
@@ -1782,6 +2990,26 @@
             </w:r>
           </w:p>
         </w:tc>
+        <w:tc>
+          <w:tcPr>
+            <w:tcW w:type="dxa" w:w="2957"/>
+            <w:tcMar>
+              <w:top w:w="80" w:type="dxa"/>
+              <w:start w:w="120" w:type="dxa"/>
+              <w:bottom w:w="80" w:type="dxa"/>
+              <w:end w:w="120" w:type="dxa"/>
+            </w:tcMar>
+            <w:vAlign w:val="top"/>
+          </w:tcPr>
+          <w:p>
+            <w:pPr>
+              <w:spacing w:after="0"/>
+            </w:pPr>
+            <w:r>
+              <w:t>Size × 20</w:t>
+            </w:r>
+          </w:p>
+        </w:tc>
       </w:tr>
       <w:tr>
         <w:trPr>
@@ -1789,7 +3017,7 @@
         </w:trPr>
         <w:tc>
           <w:tcPr>
-            <w:tcW w:type="dxa" w:w="6052"/>
+            <w:tcW w:type="dxa" w:w="4126"/>
             <w:tcMar>
               <w:top w:w="80" w:type="dxa"/>
               <w:start w:w="120" w:type="dxa"/>
@@ -1809,7 +3037,7 @@
         </w:tc>
         <w:tc>
           <w:tcPr>
-            <w:tcW w:type="dxa" w:w="3988"/>
+            <w:tcW w:type="dxa" w:w="2957"/>
             <w:tcMar>
               <w:top w:w="80" w:type="dxa"/>
               <w:start w:w="120" w:type="dxa"/>
@@ -1827,6 +3055,26 @@
             </w:r>
           </w:p>
         </w:tc>
+        <w:tc>
+          <w:tcPr>
+            <w:tcW w:type="dxa" w:w="2957"/>
+            <w:tcMar>
+              <w:top w:w="80" w:type="dxa"/>
+              <w:start w:w="120" w:type="dxa"/>
+              <w:bottom w:w="80" w:type="dxa"/>
+              <w:end w:w="120" w:type="dxa"/>
+            </w:tcMar>
+            <w:vAlign w:val="top"/>
+          </w:tcPr>
+          <w:p>
+            <w:pPr>
+              <w:spacing w:after="0"/>
+            </w:pPr>
+            <w:r>
+              <w:t>Size × 40</w:t>
+            </w:r>
+          </w:p>
+        </w:tc>
       </w:tr>
       <w:tr>
         <w:trPr>
@@ -1834,7 +3082,7 @@
         </w:trPr>
         <w:tc>
           <w:tcPr>
-            <w:tcW w:type="dxa" w:w="6052"/>
+            <w:tcW w:type="dxa" w:w="4126"/>
             <w:tcMar>
               <w:top w:w="80" w:type="dxa"/>
               <w:start w:w="120" w:type="dxa"/>
@@ -1854,7 +3102,7 @@
         </w:tc>
         <w:tc>
           <w:tcPr>
-            <w:tcW w:type="dxa" w:w="3988"/>
+            <w:tcW w:type="dxa" w:w="2957"/>
             <w:tcMar>
               <w:top w:w="80" w:type="dxa"/>
               <w:start w:w="120" w:type="dxa"/>
@@ -1872,6 +3120,26 @@
             </w:r>
           </w:p>
         </w:tc>
+        <w:tc>
+          <w:tcPr>
+            <w:tcW w:type="dxa" w:w="2957"/>
+            <w:tcMar>
+              <w:top w:w="80" w:type="dxa"/>
+              <w:start w:w="120" w:type="dxa"/>
+              <w:bottom w:w="80" w:type="dxa"/>
+              <w:end w:w="120" w:type="dxa"/>
+            </w:tcMar>
+            <w:vAlign w:val="top"/>
+          </w:tcPr>
+          <w:p>
+            <w:pPr>
+              <w:spacing w:after="0"/>
+            </w:pPr>
+            <w:r>
+              <w:t>Size × 60</w:t>
+            </w:r>
+          </w:p>
+        </w:tc>
       </w:tr>
       <w:tr>
         <w:trPr>
@@ -1879,7 +3147,7 @@
         </w:trPr>
         <w:tc>
           <w:tcPr>
-            <w:tcW w:type="dxa" w:w="6052"/>
+            <w:tcW w:type="dxa" w:w="4126"/>
             <w:tcMar>
               <w:top w:w="80" w:type="dxa"/>
               <w:start w:w="120" w:type="dxa"/>
@@ -1899,7 +3167,7 @@
         </w:tc>
         <w:tc>
           <w:tcPr>
-            <w:tcW w:type="dxa" w:w="3988"/>
+            <w:tcW w:type="dxa" w:w="2957"/>
             <w:tcMar>
               <w:top w:w="80" w:type="dxa"/>
               <w:start w:w="120" w:type="dxa"/>
@@ -1917,6 +3185,26 @@
             </w:r>
           </w:p>
         </w:tc>
+        <w:tc>
+          <w:tcPr>
+            <w:tcW w:type="dxa" w:w="2957"/>
+            <w:tcMar>
+              <w:top w:w="80" w:type="dxa"/>
+              <w:start w:w="120" w:type="dxa"/>
+              <w:bottom w:w="80" w:type="dxa"/>
+              <w:end w:w="120" w:type="dxa"/>
+            </w:tcMar>
+            <w:vAlign w:val="top"/>
+          </w:tcPr>
+          <w:p>
+            <w:pPr>
+              <w:spacing w:after="0"/>
+            </w:pPr>
+            <w:r>
+              <w:t>Size × 100</w:t>
+            </w:r>
+          </w:p>
+        </w:tc>
       </w:tr>
       <w:tr>
         <w:trPr>
@@ -1924,7 +3212,7 @@
         </w:trPr>
         <w:tc>
           <w:tcPr>
-            <w:tcW w:type="dxa" w:w="6052"/>
+            <w:tcW w:type="dxa" w:w="4126"/>
             <w:tcMar>
               <w:top w:w="80" w:type="dxa"/>
               <w:start w:w="120" w:type="dxa"/>
@@ -1944,7 +3232,27 @@
         </w:tc>
         <w:tc>
           <w:tcPr>
-            <w:tcW w:type="dxa" w:w="3988"/>
+            <w:tcW w:type="dxa" w:w="2957"/>
+            <w:tcMar>
+              <w:top w:w="80" w:type="dxa"/>
+              <w:start w:w="120" w:type="dxa"/>
+              <w:bottom w:w="80" w:type="dxa"/>
+              <w:end w:w="120" w:type="dxa"/>
+            </w:tcMar>
+            <w:vAlign w:val="top"/>
+          </w:tcPr>
+          <w:p>
+            <w:pPr>
+              <w:spacing w:after="0"/>
+            </w:pPr>
+            <w:r>
+              <w:t>Multiply repair cost by 1.5; round up</w:t>
+            </w:r>
+          </w:p>
+        </w:tc>
+        <w:tc>
+          <w:tcPr>
+            <w:tcW w:type="dxa" w:w="2957"/>
             <w:tcMar>
               <w:top w:w="80" w:type="dxa"/>
               <w:start w:w="120" w:type="dxa"/>
@@ -1969,7 +3277,7 @@
         </w:trPr>
         <w:tc>
           <w:tcPr>
-            <w:tcW w:type="dxa" w:w="6052"/>
+            <w:tcW w:type="dxa" w:w="4126"/>
             <w:tcMar>
               <w:top w:w="80" w:type="dxa"/>
               <w:start w:w="120" w:type="dxa"/>
@@ -1989,7 +3297,27 @@
         </w:tc>
         <w:tc>
           <w:tcPr>
-            <w:tcW w:type="dxa" w:w="3988"/>
+            <w:tcW w:type="dxa" w:w="2957"/>
+            <w:tcMar>
+              <w:top w:w="80" w:type="dxa"/>
+              <w:start w:w="120" w:type="dxa"/>
+              <w:bottom w:w="80" w:type="dxa"/>
+              <w:end w:w="120" w:type="dxa"/>
+            </w:tcMar>
+            <w:vAlign w:val="top"/>
+          </w:tcPr>
+          <w:p>
+            <w:pPr>
+              <w:spacing w:after="0"/>
+            </w:pPr>
+            <w:r>
+              <w:t>Halve repair cost; round up</w:t>
+            </w:r>
+          </w:p>
+        </w:tc>
+        <w:tc>
+          <w:tcPr>
+            <w:tcW w:type="dxa" w:w="2957"/>
             <w:tcMar>
               <w:top w:w="80" w:type="dxa"/>
               <w:start w:w="120" w:type="dxa"/>
@@ -2014,7 +3342,7 @@
         </w:trPr>
         <w:tc>
           <w:tcPr>
-            <w:tcW w:type="dxa" w:w="6052"/>
+            <w:tcW w:type="dxa" w:w="4126"/>
             <w:tcMar>
               <w:top w:w="80" w:type="dxa"/>
               <w:start w:w="120" w:type="dxa"/>
@@ -2034,7 +3362,7 @@
         </w:tc>
         <w:tc>
           <w:tcPr>
-            <w:tcW w:type="dxa" w:w="3988"/>
+            <w:tcW w:type="dxa" w:w="2957"/>
             <w:tcMar>
               <w:top w:w="80" w:type="dxa"/>
               <w:start w:w="120" w:type="dxa"/>
@@ -2048,7 +3376,27 @@
               <w:spacing w:after="0"/>
             </w:pPr>
             <w:r>
-              <w:t>Actual pilot-adjusted BV in SP</w:t>
+              <w:t>Actual pilot-adjusted BV</w:t>
+            </w:r>
+          </w:p>
+        </w:tc>
+        <w:tc>
+          <w:tcPr>
+            <w:tcW w:type="dxa" w:w="2957"/>
+            <w:tcMar>
+              <w:top w:w="80" w:type="dxa"/>
+              <w:start w:w="120" w:type="dxa"/>
+              <w:bottom w:w="80" w:type="dxa"/>
+              <w:end w:w="120" w:type="dxa"/>
+            </w:tcMar>
+            <w:vAlign w:val="top"/>
+          </w:tcPr>
+          <w:p>
+            <w:pPr>
+              <w:spacing w:after="0"/>
+            </w:pPr>
+            <w:r>
+              <w:t>Actual Skill-adjusted PV × 40</w:t>
             </w:r>
           </w:p>
         </w:tc>
@@ -2059,7 +3407,7 @@
         </w:trPr>
         <w:tc>
           <w:tcPr>
-            <w:tcW w:type="dxa" w:w="6052"/>
+            <w:tcW w:type="dxa" w:w="4126"/>
             <w:tcMar>
               <w:top w:w="80" w:type="dxa"/>
               <w:start w:w="120" w:type="dxa"/>
@@ -2079,7 +3427,7 @@
         </w:tc>
         <w:tc>
           <w:tcPr>
-            <w:tcW w:type="dxa" w:w="3988"/>
+            <w:tcW w:type="dxa" w:w="2957"/>
             <w:tcMar>
               <w:top w:w="80" w:type="dxa"/>
               <w:start w:w="120" w:type="dxa"/>
@@ -2097,6 +3445,26 @@
             </w:r>
           </w:p>
         </w:tc>
+        <w:tc>
+          <w:tcPr>
+            <w:tcW w:type="dxa" w:w="2957"/>
+            <w:tcMar>
+              <w:top w:w="80" w:type="dxa"/>
+              <w:start w:w="120" w:type="dxa"/>
+              <w:bottom w:w="80" w:type="dxa"/>
+              <w:end w:w="120" w:type="dxa"/>
+            </w:tcMar>
+            <w:vAlign w:val="top"/>
+          </w:tcPr>
+          <w:p>
+            <w:pPr>
+              <w:spacing w:after="0"/>
+            </w:pPr>
+            <w:r>
+              <w:t>PV × 20</w:t>
+            </w:r>
+          </w:p>
+        </w:tc>
       </w:tr>
       <w:tr>
         <w:trPr>
@@ -2104,7 +3472,7 @@
         </w:trPr>
         <w:tc>
           <w:tcPr>
-            <w:tcW w:type="dxa" w:w="6052"/>
+            <w:tcW w:type="dxa" w:w="4126"/>
             <w:tcMar>
               <w:top w:w="80" w:type="dxa"/>
               <w:start w:w="120" w:type="dxa"/>
@@ -2124,7 +3492,7 @@
         </w:tc>
         <w:tc>
           <w:tcPr>
-            <w:tcW w:type="dxa" w:w="3988"/>
+            <w:tcW w:type="dxa" w:w="2957"/>
             <w:tcMar>
               <w:top w:w="80" w:type="dxa"/>
               <w:start w:w="120" w:type="dxa"/>
@@ -2142,6 +3510,26 @@
             </w:r>
           </w:p>
         </w:tc>
+        <w:tc>
+          <w:tcPr>
+            <w:tcW w:type="dxa" w:w="2957"/>
+            <w:tcMar>
+              <w:top w:w="80" w:type="dxa"/>
+              <w:start w:w="120" w:type="dxa"/>
+              <w:bottom w:w="80" w:type="dxa"/>
+              <w:end w:w="120" w:type="dxa"/>
+            </w:tcMar>
+            <w:vAlign w:val="top"/>
+          </w:tcPr>
+          <w:p>
+            <w:pPr>
+              <w:spacing w:after="0"/>
+            </w:pPr>
+            <w:r>
+              <w:t>PV × 10</w:t>
+            </w:r>
+          </w:p>
+        </w:tc>
       </w:tr>
       <w:tr>
         <w:trPr>
@@ -2149,7 +3537,7 @@
         </w:trPr>
         <w:tc>
           <w:tcPr>
-            <w:tcW w:type="dxa" w:w="6052"/>
+            <w:tcW w:type="dxa" w:w="4126"/>
             <w:tcMar>
               <w:top w:w="80" w:type="dxa"/>
               <w:start w:w="120" w:type="dxa"/>
@@ -2169,7 +3557,7 @@
         </w:tc>
         <w:tc>
           <w:tcPr>
-            <w:tcW w:type="dxa" w:w="3988"/>
+            <w:tcW w:type="dxa" w:w="2957"/>
             <w:tcMar>
               <w:top w:w="80" w:type="dxa"/>
               <w:start w:w="120" w:type="dxa"/>
@@ -2187,6 +3575,26 @@
             </w:r>
           </w:p>
         </w:tc>
+        <w:tc>
+          <w:tcPr>
+            <w:tcW w:type="dxa" w:w="2957"/>
+            <w:tcMar>
+              <w:top w:w="80" w:type="dxa"/>
+              <w:start w:w="120" w:type="dxa"/>
+              <w:bottom w:w="80" w:type="dxa"/>
+              <w:end w:w="120" w:type="dxa"/>
+            </w:tcMar>
+            <w:vAlign w:val="top"/>
+          </w:tcPr>
+          <w:p>
+            <w:pPr>
+              <w:spacing w:after="0"/>
+            </w:pPr>
+            <w:r>
+              <w:t>20 SP per unit without ENE</w:t>
+            </w:r>
+          </w:p>
+        </w:tc>
       </w:tr>
       <w:tr>
         <w:trPr>
@@ -2194,7 +3602,7 @@
         </w:trPr>
         <w:tc>
           <w:tcPr>
-            <w:tcW w:type="dxa" w:w="6052"/>
+            <w:tcW w:type="dxa" w:w="4126"/>
             <w:tcMar>
               <w:top w:w="80" w:type="dxa"/>
               <w:start w:w="120" w:type="dxa"/>
@@ -2214,7 +3622,7 @@
         </w:tc>
         <w:tc>
           <w:tcPr>
-            <w:tcW w:type="dxa" w:w="3988"/>
+            <w:tcW w:type="dxa" w:w="2957"/>
             <w:tcMar>
               <w:top w:w="80" w:type="dxa"/>
               <w:start w:w="120" w:type="dxa"/>
@@ -2232,6 +3640,26 @@
             </w:r>
           </w:p>
         </w:tc>
+        <w:tc>
+          <w:tcPr>
+            <w:tcW w:type="dxa" w:w="2957"/>
+            <w:tcMar>
+              <w:top w:w="80" w:type="dxa"/>
+              <w:start w:w="120" w:type="dxa"/>
+              <w:bottom w:w="80" w:type="dxa"/>
+              <w:end w:w="120" w:type="dxa"/>
+            </w:tcMar>
+            <w:vAlign w:val="top"/>
+          </w:tcPr>
+          <w:p>
+            <w:pPr>
+              <w:spacing w:after="0"/>
+            </w:pPr>
+            <w:r>
+              <w:t>20 SP per available munition type</w:t>
+            </w:r>
+          </w:p>
+        </w:tc>
       </w:tr>
       <w:tr>
         <w:trPr>
@@ -2239,7 +3667,7 @@
         </w:trPr>
         <w:tc>
           <w:tcPr>
-            <w:tcW w:type="dxa" w:w="6052"/>
+            <w:tcW w:type="dxa" w:w="4126"/>
             <w:tcMar>
               <w:top w:w="80" w:type="dxa"/>
               <w:start w:w="120" w:type="dxa"/>
@@ -2259,7 +3687,7 @@
         </w:tc>
         <w:tc>
           <w:tcPr>
-            <w:tcW w:type="dxa" w:w="3988"/>
+            <w:tcW w:type="dxa" w:w="2957"/>
             <w:tcMar>
               <w:top w:w="80" w:type="dxa"/>
               <w:start w:w="120" w:type="dxa"/>
@@ -2277,14 +3705,9 @@
             </w:r>
           </w:p>
         </w:tc>
-      </w:tr>
-      <w:tr>
-        <w:trPr>
-          <w:cantSplit/>
-        </w:trPr>
         <w:tc>
           <w:tcPr>
-            <w:tcW w:type="dxa" w:w="6052"/>
+            <w:tcW w:type="dxa" w:w="2957"/>
             <w:tcMar>
               <w:top w:w="80" w:type="dxa"/>
               <w:start w:w="120" w:type="dxa"/>
@@ -2298,13 +3721,38 @@
               <w:spacing w:after="0"/>
             </w:pPr>
             <w:r>
-              <w:t>Heal MechWarrior</w:t>
+              <w:t>Size × 10</w:t>
+            </w:r>
+          </w:p>
+        </w:tc>
+      </w:tr>
+      <w:tr>
+        <w:trPr>
+          <w:cantSplit/>
+        </w:trPr>
+        <w:tc>
+          <w:tcPr>
+            <w:tcW w:type="dxa" w:w="4126"/>
+            <w:tcMar>
+              <w:top w:w="80" w:type="dxa"/>
+              <w:start w:w="120" w:type="dxa"/>
+              <w:bottom w:w="80" w:type="dxa"/>
+              <w:end w:w="120" w:type="dxa"/>
+            </w:tcMar>
+            <w:vAlign w:val="top"/>
+          </w:tcPr>
+          <w:p>
+            <w:pPr>
+              <w:spacing w:after="0"/>
+            </w:pPr>
+            <w:r>
+              <w:t>Heal MechWarrior or crew</w:t>
             </w:r>
           </w:p>
         </w:tc>
         <w:tc>
           <w:tcPr>
-            <w:tcW w:type="dxa" w:w="3988"/>
+            <w:tcW w:type="dxa" w:w="2957"/>
             <w:tcMar>
               <w:top w:w="80" w:type="dxa"/>
               <w:start w:w="120" w:type="dxa"/>
@@ -2322,6 +3770,26 @@
             </w:r>
           </w:p>
         </w:tc>
+        <w:tc>
+          <w:tcPr>
+            <w:tcW w:type="dxa" w:w="2957"/>
+            <w:tcMar>
+              <w:top w:w="80" w:type="dxa"/>
+              <w:start w:w="120" w:type="dxa"/>
+              <w:bottom w:w="80" w:type="dxa"/>
+              <w:end w:w="120" w:type="dxa"/>
+            </w:tcMar>
+            <w:vAlign w:val="top"/>
+          </w:tcPr>
+          <w:p>
+            <w:pPr>
+              <w:spacing w:after="0"/>
+            </w:pPr>
+            <w:r>
+              <w:t>30 SP per injury</w:t>
+            </w:r>
+          </w:p>
+        </w:tc>
       </w:tr>
       <w:tr>
         <w:trPr>
@@ -2329,7 +3797,7 @@
         </w:trPr>
         <w:tc>
           <w:tcPr>
-            <w:tcW w:type="dxa" w:w="6052"/>
+            <w:tcW w:type="dxa" w:w="4126"/>
             <w:tcMar>
               <w:top w:w="80" w:type="dxa"/>
               <w:start w:w="120" w:type="dxa"/>
@@ -2349,7 +3817,27 @@
         </w:tc>
         <w:tc>
           <w:tcPr>
-            <w:tcW w:type="dxa" w:w="3988"/>
+            <w:tcW w:type="dxa" w:w="2957"/>
+            <w:tcMar>
+              <w:top w:w="80" w:type="dxa"/>
+              <w:start w:w="120" w:type="dxa"/>
+              <w:bottom w:w="80" w:type="dxa"/>
+              <w:end w:w="120" w:type="dxa"/>
+            </w:tcMar>
+            <w:vAlign w:val="top"/>
+          </w:tcPr>
+          <w:p>
+            <w:pPr>
+              <w:spacing w:after="0"/>
+            </w:pPr>
+            <w:r>
+              <w:t>10 SP</w:t>
+            </w:r>
+          </w:p>
+        </w:tc>
+        <w:tc>
+          <w:tcPr>
+            <w:tcW w:type="dxa" w:w="2957"/>
             <w:tcMar>
               <w:top w:w="80" w:type="dxa"/>
               <w:start w:w="120" w:type="dxa"/>
@@ -2374,7 +3862,7 @@
         </w:trPr>
         <w:tc>
           <w:tcPr>
-            <w:tcW w:type="dxa" w:w="6052"/>
+            <w:tcW w:type="dxa" w:w="4126"/>
             <w:tcMar>
               <w:top w:w="80" w:type="dxa"/>
               <w:start w:w="120" w:type="dxa"/>
@@ -2394,7 +3882,27 @@
         </w:tc>
         <w:tc>
           <w:tcPr>
-            <w:tcW w:type="dxa" w:w="3988"/>
+            <w:tcW w:type="dxa" w:w="2957"/>
+            <w:tcMar>
+              <w:top w:w="80" w:type="dxa"/>
+              <w:start w:w="120" w:type="dxa"/>
+              <w:bottom w:w="80" w:type="dxa"/>
+              <w:end w:w="120" w:type="dxa"/>
+            </w:tcMar>
+            <w:vAlign w:val="top"/>
+          </w:tcPr>
+          <w:p>
+            <w:pPr>
+              <w:spacing w:after="0"/>
+            </w:pPr>
+            <w:r>
+              <w:t>20 SP</w:t>
+            </w:r>
+          </w:p>
+        </w:tc>
+        <w:tc>
+          <w:tcPr>
+            <w:tcW w:type="dxa" w:w="2957"/>
             <w:tcMar>
               <w:top w:w="80" w:type="dxa"/>
               <w:start w:w="120" w:type="dxa"/>
@@ -2453,6 +3961,28 @@
       </w:r>
     </w:p>
     <w:p>
+      <w:r>
+        <w:rPr>
+          <w:b/>
+        </w:rPr>
+        <w:t xml:space="preserve">Alpha Strike Ammunition. </w:t>
+      </w:r>
+      <w:r>
+        <w:t>Every participating Alpha Strike unit without ENE must be rearmed. Until then, reduce its weapon damage by 1 at every range, minimum 0, and it cannot use ammunition-dependent abilities, including ART, BOMB, FLK, HT, IF, LRM, MSL, SRM, TOR, AMS, C3RS, MDS, NARC, and RSD. An unrearmed ENE aerospace unit loses BOMB but is otherwise unaffected.</w:t>
+      </w:r>
+    </w:p>
+    <w:p>
+      <w:r>
+        <w:rPr>
+          <w:b/>
+        </w:rPr>
+        <w:t xml:space="preserve">Alternate Munitions. </w:t>
+      </w:r>
+      <w:r>
+        <w:t>Pay 20 SP for each alternate munition type made available to an Alpha Strike unit; standard rearming provides none.</w:t>
+      </w:r>
+    </w:p>
+    <w:p>
       <w:pPr>
         <w:pStyle w:val="Heading2"/>
       </w:pPr>
@@ -2498,10 +4028,21 @@
         <w:rPr>
           <w:b/>
         </w:rPr>
-        <w:t xml:space="preserve">Truly Destroyed. </w:t>
+        <w:t xml:space="preserve">Classic BattleTech Destruction. </w:t>
       </w:r>
       <w:r>
-        <w:t>A BattleMech is truly destroyed when its center-torso structure is eliminated. A vehicle is truly destroyed by a fuel-tank explosion or by elimination of internal structure in a non-turret, non-rotor location. Battle armor uses a 7+ unit-survival check. A truly destroyed unit cannot be recovered or repaired.</w:t>
+        <w:t>A BattleMech is truly destroyed when its center-torso structure is eliminated. A vehicle is truly destroyed by a fuel-tank explosion or loss of internal structure in a non-turret, non-rotor location. Battle armor uses a 7+ survival check. Truly destroyed units cannot be recovered or repaired.</w:t>
+      </w:r>
+    </w:p>
+    <w:p>
+      <w:r>
+        <w:rPr>
+          <w:b/>
+        </w:rPr>
+        <w:t xml:space="preserve">Alpha Strike Destruction. </w:t>
+      </w:r>
+      <w:r>
+        <w:t>A unit destroyed by an Ammo Hit or Fuel Hit without CASE or CASEII, or in a crash, is truly destroyed. A ground unit destroyed by a Unit Destroyed or Crew Killed critical remains eligible for the Recovery Roll.</w:t>
       </w:r>
     </w:p>
     <w:p>
@@ -2524,27 +4065,36 @@
       </w:r>
     </w:p>
     <w:p>
-      <w:pPr>
-        <w:pStyle w:val="ListBullet"/>
-      </w:pPr>
       <w:r>
-        <w:t>A vehicle crew is killed when its vehicle is destroyed.</w:t>
+        <w:rPr>
+          <w:b/>
+        </w:rPr>
+        <w:t xml:space="preserve">Classic BattleTech Personnel. </w:t>
+      </w:r>
+      <w:r>
+        <w:t>A destroyed vehicle's crew is killed. Each Commander Hit or Crew Stunned result inflicts one wound. Each battle armor trooper survives destruction on 7+; Clan battle armor applies a −2 modifier.</w:t>
       </w:r>
     </w:p>
     <w:p>
-      <w:pPr>
-        <w:pStyle w:val="ListBullet"/>
-      </w:pPr>
       <w:r>
-        <w:t>Each Commander Hit or Crew Stunned result inflicts one wound on the affected crew member.</w:t>
+        <w:rPr>
+          <w:b/>
+        </w:rPr>
+        <w:t xml:space="preserve">Alpha Strike Criticals. </w:t>
+      </w:r>
+      <w:r>
+        <w:t>A Crew Killed or Unit Destroyed critical kills the pilot or crew. A Crew Stunned critical wounds the pilot or crew.</w:t>
       </w:r>
     </w:p>
     <w:p>
-      <w:pPr>
-        <w:pStyle w:val="ListBullet"/>
-      </w:pPr>
       <w:r>
-        <w:t>Each battle armor trooper survives destruction on 7+; Clan battle armor applies a −2 modifier to this target number.</w:t>
+        <w:rPr>
+          <w:b/>
+        </w:rPr>
+        <w:t xml:space="preserve">Alpha Strike Destroyed Units. </w:t>
+      </w:r>
+      <w:r>
+        <w:t>If a destroyed unit's personnel were not already killed, roll 2D6: on 6+ they are unharmed; on 4–5 they are wounded; on 2–3 they are killed. A wounded pilot or crew counts as three injuries for healing costs.</w:t>
       </w:r>
     </w:p>
     <w:p>
@@ -3407,6 +4957,9 @@
       </w:pPr>
     </w:p>
     <w:p>
+      <w:pPr>
+        <w:keepLines/>
+      </w:pPr>
       <w:r>
         <w:rPr>
           <w:b/>
@@ -3414,7 +4967,7 @@
         <w:t xml:space="preserve">Edge. </w:t>
       </w:r>
       <w:r>
-        <w:t>At the start of each Track, each named commander's Edge refreshes to its current rating; unspent Edge never carries over. After rolling, spend 1 Edge to add +1 to an attack roll, reroll a motive-damage result, or reroll a critical hit scored against that commander's unit. Edge and Edge Abilities belong to the commander and cannot be transferred.</w:t>
+        <w:t>Each named commander's Edge refreshes at the start of a Track; unspent Edge does not carry over. After rolling, spend 1 Edge to add +1 to an attack roll, reroll Motive Systems Damage, or reroll a critical hit against that commander's unit. Accept the reroll; spend no more than 1 Edge per result. In Alpha Strike, increasing 11 to 12 does not cause a natural-12 critical. Edge and Edge Abilities cannot be transferred.</w:t>
       </w:r>
     </w:p>
     <w:p>
@@ -3875,35 +5428,56 @@
       </w:r>
     </w:p>
     <w:p>
+      <w:pPr>
+        <w:spacing w:after="50" w:line="245" w:lineRule="auto"/>
+      </w:pPr>
       <w:r>
         <w:rPr>
           <w:b/>
+          <w:sz w:val="17"/>
         </w:rPr>
         <w:t xml:space="preserve">Track End. </w:t>
       </w:r>
       <w:r>
+        <w:rPr>
+          <w:sz w:val="17"/>
+        </w:rPr>
         <w:t>Unless a Track states otherwise, check every Track End condition during the End Phase. An objective ends a Track only when its rules specifically say so.</w:t>
       </w:r>
     </w:p>
     <w:p>
+      <w:pPr>
+        <w:spacing w:after="50" w:line="245" w:lineRule="auto"/>
+      </w:pPr>
       <w:r>
         <w:rPr>
           <w:b/>
+          <w:sz w:val="17"/>
         </w:rPr>
         <w:t xml:space="preserve">Published Values. </w:t>
       </w:r>
       <w:r>
+        <w:rPr>
+          <w:sz w:val="17"/>
+        </w:rPr>
         <w:t>Retain every published objective value that this document does not expressly replace. Ignore all Orders objectives.</w:t>
       </w:r>
     </w:p>
     <w:p>
+      <w:pPr>
+        <w:spacing w:after="50" w:line="245" w:lineRule="auto"/>
+      </w:pPr>
       <w:r>
         <w:rPr>
           <w:b/>
+          <w:sz w:val="17"/>
         </w:rPr>
         <w:t xml:space="preserve">Recovery. </w:t>
       </w:r>
       <w:r>
+        <w:rPr>
+          <w:sz w:val="17"/>
+        </w:rPr>
         <w:t>Apply the campaign-wide original-owner recovery rules even when the Draconis Reach version of a Track prohibits salvage.</w:t>
       </w:r>
     </w:p>
@@ -3916,24 +5490,38 @@
       </w:r>
     </w:p>
     <w:p>
+      <w:pPr>
+        <w:spacing w:after="50" w:line="245" w:lineRule="auto"/>
+      </w:pPr>
       <w:r>
         <w:rPr>
           <w:b/>
+          <w:sz w:val="17"/>
         </w:rPr>
         <w:t xml:space="preserve">Conquer. </w:t>
       </w:r>
       <w:r>
+        <w:rPr>
+          <w:sz w:val="17"/>
+        </w:rPr>
         <w:t>Completing Conquer does not end the Track. If both sides complete it in the same End Phase, neither side scores it.</w:t>
       </w:r>
     </w:p>
     <w:p>
+      <w:pPr>
+        <w:spacing w:after="50" w:line="245" w:lineRule="auto"/>
+      </w:pPr>
       <w:r>
         <w:rPr>
           <w:b/>
+          <w:sz w:val="17"/>
         </w:rPr>
         <w:t xml:space="preserve">Track End. </w:t>
       </w:r>
       <w:r>
+        <w:rPr>
+          <w:sz w:val="17"/>
+        </w:rPr>
         <w:t>During the End Phase, the Track ends if either side has no non-crippled units in play or the turn limit has been reached: Turn 10, or Turn 8 in the shortened format.</w:t>
       </w:r>
     </w:p>
@@ -3946,24 +5534,38 @@
       </w:r>
     </w:p>
     <w:p>
+      <w:pPr>
+        <w:spacing w:after="50" w:line="245" w:lineRule="auto"/>
+      </w:pPr>
       <w:r>
         <w:rPr>
           <w:b/>
+          <w:sz w:val="17"/>
         </w:rPr>
         <w:t xml:space="preserve">Objective Sequence. </w:t>
       </w:r>
       <w:r>
+        <w:rPr>
+          <w:sz w:val="17"/>
+        </w:rPr>
         <w:t>Completing either preliminary objective does not end the Track.</w:t>
       </w:r>
     </w:p>
     <w:p>
+      <w:pPr>
+        <w:spacing w:after="50" w:line="245" w:lineRule="auto"/>
+      </w:pPr>
       <w:r>
         <w:rPr>
           <w:b/>
+          <w:sz w:val="17"/>
         </w:rPr>
         <w:t xml:space="preserve">Track End. </w:t>
       </w:r>
       <w:r>
+        <w:rPr>
+          <w:sz w:val="17"/>
+        </w:rPr>
         <w:t>During the End Phase, the Track ends if one side completes Hold the Field, either side has no units in play, or the turn limit has been reached: Turn 10, or Turn 8 in the shortened format.</w:t>
       </w:r>
     </w:p>
@@ -3976,24 +5578,38 @@
       </w:r>
     </w:p>
     <w:p>
+      <w:pPr>
+        <w:spacing w:after="50" w:line="245" w:lineRule="auto"/>
+      </w:pPr>
       <w:r>
         <w:rPr>
           <w:b/>
+          <w:sz w:val="17"/>
         </w:rPr>
         <w:t xml:space="preserve">Make Their Acquaintance. </w:t>
       </w:r>
       <w:r>
+        <w:rPr>
+          <w:sz w:val="17"/>
+        </w:rPr>
         <w:t>The first side to cripple or destroy one-third of the opposing force's BV scores this objective. If both sides reach the threshold in the same End Phase, neither scores it. Voluntary withdrawals count toward the threshold.</w:t>
       </w:r>
     </w:p>
     <w:p>
+      <w:pPr>
+        <w:spacing w:after="50" w:line="245" w:lineRule="auto"/>
+      </w:pPr>
       <w:r>
         <w:rPr>
           <w:b/>
+          <w:sz w:val="17"/>
         </w:rPr>
         <w:t xml:space="preserve">Force Points Option. </w:t>
       </w:r>
       <w:r>
+        <w:rPr>
+          <w:sz w:val="17"/>
+        </w:rPr>
         <w:t>If Force Points are used instead of BV, use a 50% threshold.</w:t>
       </w:r>
     </w:p>
@@ -4006,79 +5622,128 @@
       </w:r>
     </w:p>
     <w:p>
+      <w:pPr>
+        <w:spacing w:after="50" w:line="245" w:lineRule="auto"/>
+      </w:pPr>
       <w:r>
         <w:rPr>
           <w:b/>
+          <w:sz w:val="17"/>
         </w:rPr>
         <w:t xml:space="preserve">Defender Emplacements. </w:t>
       </w:r>
       <w:r>
+        <w:rPr>
+          <w:sz w:val="17"/>
+        </w:rPr>
         <w:t>The Defender receives two Veteran Medium Emplacements per Campaign Scale. Each emplacement may instead be replaced by up to 20 BSP of emplacement Assets. Place them in the Attacker's half of the battlefield.</w:t>
       </w:r>
     </w:p>
     <w:p>
+      <w:pPr>
+        <w:spacing w:after="50" w:line="245" w:lineRule="auto"/>
+      </w:pPr>
       <w:r>
         <w:rPr>
           <w:b/>
+          <w:sz w:val="17"/>
         </w:rPr>
         <w:t xml:space="preserve">Attacker Entry. </w:t>
       </w:r>
       <w:r>
+        <w:rPr>
+          <w:sz w:val="17"/>
+        </w:rPr>
         <w:t>One-third of the Attacker's force enters from its home edge on Turn 1. The remainder enters from a short edge on Turn 2.</w:t>
       </w:r>
     </w:p>
     <w:p>
+      <w:pPr>
+        <w:spacing w:after="50" w:line="245" w:lineRule="auto"/>
+      </w:pPr>
       <w:r>
         <w:rPr>
           <w:b/>
+          <w:sz w:val="17"/>
         </w:rPr>
         <w:t xml:space="preserve">Thresholds. </w:t>
       </w:r>
       <w:r>
+        <w:rPr>
+          <w:sz w:val="17"/>
+        </w:rPr>
         <w:t>Crush and Turn the Tide each use a 50% threshold.</w:t>
       </w:r>
     </w:p>
     <w:p>
+      <w:pPr>
+        <w:spacing w:after="50" w:line="245" w:lineRule="auto"/>
+      </w:pPr>
       <w:r>
         <w:rPr>
           <w:b/>
+          <w:sz w:val="17"/>
         </w:rPr>
         <w:t xml:space="preserve">Cut Off Retreat. </w:t>
       </w:r>
       <w:r>
+        <w:rPr>
+          <w:sz w:val="17"/>
+        </w:rPr>
         <w:t>Maintain either one non-crippled BattleMech or two Battlefield Support Assets per Campaign Scale near the Defender's home edge for two consecutive End Phases.</w:t>
       </w:r>
     </w:p>
     <w:p>
+      <w:pPr>
+        <w:spacing w:after="50" w:line="245" w:lineRule="auto"/>
+      </w:pPr>
       <w:r>
         <w:rPr>
           <w:b/>
+          <w:sz w:val="17"/>
         </w:rPr>
         <w:t xml:space="preserve">Fall Back. </w:t>
       </w:r>
       <w:r>
+        <w:rPr>
+          <w:sz w:val="17"/>
+        </w:rPr>
         <w:t>After Turn the Tide is completed, withdraw at least 50% of the eligible force.</w:t>
       </w:r>
     </w:p>
     <w:p>
+      <w:pPr>
+        <w:spacing w:after="50" w:line="245" w:lineRule="auto"/>
+      </w:pPr>
       <w:r>
         <w:rPr>
           <w:b/>
+          <w:sz w:val="17"/>
         </w:rPr>
         <w:t xml:space="preserve">Ramming Speed. </w:t>
       </w:r>
       <w:r>
+        <w:rPr>
+          <w:sz w:val="17"/>
+        </w:rPr>
         <w:t>Add the Ramming Speed objective using its Draconis Reach procedure. It is worth 150 Objective Points.</w:t>
       </w:r>
     </w:p>
     <w:p>
+      <w:pPr>
+        <w:spacing w:after="50" w:line="245" w:lineRule="auto"/>
+      </w:pPr>
       <w:r>
         <w:rPr>
           <w:b/>
+          <w:sz w:val="17"/>
         </w:rPr>
         <w:t xml:space="preserve">Track End. </w:t>
       </w:r>
       <w:r>
+        <w:rPr>
+          <w:sz w:val="17"/>
+        </w:rPr>
         <w:t>End when either side has no units in play or at Turn 8 (Turn 6 for the shortened format).</w:t>
       </w:r>
     </w:p>
@@ -4091,46 +5756,74 @@
       </w:r>
     </w:p>
     <w:p>
+      <w:pPr>
+        <w:spacing w:after="50" w:line="245" w:lineRule="auto"/>
+      </w:pPr>
       <w:r>
         <w:rPr>
           <w:b/>
+          <w:sz w:val="17"/>
         </w:rPr>
         <w:t xml:space="preserve">Vehicle Detachment. </w:t>
       </w:r>
       <w:r>
+        <w:rPr>
+          <w:sz w:val="17"/>
+        </w:rPr>
         <w:t>The Attacker receives a separate vehicle-only detachment: 12/24/36 BSP in Original mode or 32/64/96 BSP in Modern mode. This detachment is in addition to normal Battlefield Support.</w:t>
       </w:r>
     </w:p>
     <w:p>
+      <w:pPr>
+        <w:spacing w:after="50" w:line="245" w:lineRule="auto"/>
+      </w:pPr>
       <w:r>
         <w:rPr>
           <w:b/>
+          <w:sz w:val="17"/>
         </w:rPr>
         <w:t xml:space="preserve">Entry. </w:t>
       </w:r>
       <w:r>
+        <w:rPr>
+          <w:sz w:val="17"/>
+        </w:rPr>
         <w:t>The primary force enters from its home edge on Turn 1. The vehicle detachment enters from the side edges on Turn 1, halfway toward the Defender's edge.</w:t>
       </w:r>
     </w:p>
     <w:p>
+      <w:pPr>
+        <w:spacing w:after="50" w:line="245" w:lineRule="auto"/>
+      </w:pPr>
       <w:r>
         <w:rPr>
           <w:b/>
+          <w:sz w:val="17"/>
         </w:rPr>
         <w:t xml:space="preserve">Objectives. </w:t>
       </w:r>
       <w:r>
+        <w:rPr>
+          <w:sz w:val="17"/>
+        </w:rPr>
         <w:t>Use Push; Crush at one-third; Gutted at 75%; Advance to the Rear instead of Hold Ground; Make Them Hurt at 50%; and the updated Lead objective. Remove Cut Off the Head and ignore Orders.</w:t>
       </w:r>
     </w:p>
     <w:p>
+      <w:pPr>
+        <w:spacing w:after="50" w:line="245" w:lineRule="auto"/>
+      </w:pPr>
       <w:r>
         <w:rPr>
           <w:b/>
+          <w:sz w:val="17"/>
         </w:rPr>
         <w:t xml:space="preserve">Track End. </w:t>
       </w:r>
       <w:r>
+        <w:rPr>
+          <w:sz w:val="17"/>
+        </w:rPr>
         <w:t>End when either side has no units in play or at Turn 10 (Turn 8 shortened). After Turn 6, completing Advance to the Rear also ends the Track after the End Phase.</w:t>
       </w:r>
     </w:p>
@@ -4143,68 +5836,110 @@
       </w:r>
     </w:p>
     <w:p>
+      <w:pPr>
+        <w:spacing w:after="50" w:line="245" w:lineRule="auto"/>
+      </w:pPr>
       <w:r>
         <w:rPr>
           <w:b/>
+          <w:sz w:val="17"/>
         </w:rPr>
         <w:t xml:space="preserve">Roles. </w:t>
       </w:r>
       <w:r>
+        <w:rPr>
+          <w:sz w:val="17"/>
+        </w:rPr>
         <w:t>Determine momentum by the campaign roll. The Defender flees and the Attacker pursues; the role assignment is not fixed by faction.</w:t>
       </w:r>
     </w:p>
     <w:p>
+      <w:pPr>
+        <w:spacing w:after="50" w:line="245" w:lineRule="auto"/>
+      </w:pPr>
       <w:r>
         <w:rPr>
           <w:b/>
+          <w:sz w:val="17"/>
         </w:rPr>
         <w:t xml:space="preserve">Entry. </w:t>
       </w:r>
       <w:r>
+        <w:rPr>
+          <w:sz w:val="17"/>
+        </w:rPr>
         <w:t>The Defender enters from its home edge on Turn 1. The Attacker enters from the same edge on Turn 2.</w:t>
       </w:r>
     </w:p>
     <w:p>
+      <w:pPr>
+        <w:spacing w:after="50" w:line="245" w:lineRule="auto"/>
+      </w:pPr>
       <w:r>
         <w:rPr>
           <w:b/>
+          <w:sz w:val="17"/>
         </w:rPr>
         <w:t xml:space="preserve">Force Construction. </w:t>
       </w:r>
       <w:r>
+        <w:rPr>
+          <w:sz w:val="17"/>
+        </w:rPr>
         <w:t>Use the Tukayyid equal-force construction and campaign recovery rules.</w:t>
       </w:r>
     </w:p>
     <w:p>
+      <w:pPr>
+        <w:spacing w:after="50" w:line="245" w:lineRule="auto"/>
+      </w:pPr>
       <w:r>
         <w:rPr>
           <w:b/>
+          <w:sz w:val="17"/>
         </w:rPr>
         <w:t xml:space="preserve">Fleeing Force. </w:t>
       </w:r>
       <w:r>
+        <w:rPr>
+          <w:sz w:val="17"/>
+        </w:rPr>
         <w:t>At least half of the Defender's force must have a maximum movement of 8 or less (16 inches or less in Alpha Strike). Temporary damage does not make a unit qualify.</w:t>
       </w:r>
     </w:p>
     <w:p>
+      <w:pPr>
+        <w:spacing w:after="50" w:line="245" w:lineRule="auto"/>
+      </w:pPr>
       <w:r>
         <w:rPr>
           <w:b/>
+          <w:sz w:val="17"/>
         </w:rPr>
         <w:t xml:space="preserve">Objectives. </w:t>
       </w:r>
       <w:r>
+        <w:rPr>
+          <w:sz w:val="17"/>
+        </w:rPr>
         <w:t>Qualifying units count for Escape and Never Here.</w:t>
       </w:r>
     </w:p>
     <w:p>
+      <w:pPr>
+        <w:spacing w:after="50" w:line="245" w:lineRule="auto"/>
+      </w:pPr>
       <w:r>
         <w:rPr>
           <w:b/>
+          <w:sz w:val="17"/>
         </w:rPr>
         <w:t xml:space="preserve">Track End. </w:t>
       </w:r>
       <w:r>
+        <w:rPr>
+          <w:sz w:val="17"/>
+        </w:rPr>
         <w:t>End when either side has no non-crippled units in play or at Turn 10.</w:t>
       </w:r>
     </w:p>
@@ -4217,57 +5952,92 @@
       </w:r>
     </w:p>
     <w:p>
+      <w:pPr>
+        <w:spacing w:after="50" w:line="245" w:lineRule="auto"/>
+      </w:pPr>
       <w:r>
         <w:rPr>
           <w:b/>
+          <w:sz w:val="17"/>
         </w:rPr>
         <w:t xml:space="preserve">Defender Deployment. </w:t>
       </w:r>
       <w:r>
+        <w:rPr>
+          <w:sz w:val="17"/>
+        </w:rPr>
         <w:t>Use the restricted Defender deployment from Draconis Reach.</w:t>
       </w:r>
     </w:p>
     <w:p>
+      <w:pPr>
+        <w:spacing w:after="50" w:line="245" w:lineRule="auto"/>
+      </w:pPr>
       <w:r>
         <w:rPr>
           <w:b/>
+          <w:sz w:val="17"/>
         </w:rPr>
         <w:t xml:space="preserve">Scan. </w:t>
       </w:r>
       <w:r>
+        <w:rPr>
+          <w:sz w:val="17"/>
+        </w:rPr>
         <w:t>The Attacker must scan two-thirds of the required targets. Preemptive Strike uses a 25% threshold.</w:t>
       </w:r>
     </w:p>
     <w:p>
+      <w:pPr>
+        <w:spacing w:after="50" w:line="245" w:lineRule="auto"/>
+      </w:pPr>
       <w:r>
         <w:rPr>
           <w:b/>
+          <w:sz w:val="17"/>
         </w:rPr>
         <w:t xml:space="preserve">Observe and Report. </w:t>
       </w:r>
       <w:r>
+        <w:rPr>
+          <w:sz w:val="17"/>
+        </w:rPr>
         <w:t>Use Observe and Report in place of Escape. Withdrawal may begin after Turn 4.</w:t>
       </w:r>
     </w:p>
     <w:p>
+      <w:pPr>
+        <w:spacing w:after="50" w:line="245" w:lineRule="auto"/>
+      </w:pPr>
       <w:r>
         <w:rPr>
           <w:b/>
+          <w:sz w:val="17"/>
         </w:rPr>
         <w:t xml:space="preserve">Deny. </w:t>
       </w:r>
       <w:r>
+        <w:rPr>
+          <w:sz w:val="17"/>
+        </w:rPr>
         <w:t>Score Deny proportionally. Defender units that withdraw early count as scanned or destroyed, as applicable.</w:t>
       </w:r>
     </w:p>
     <w:p>
+      <w:pPr>
+        <w:spacing w:after="50" w:line="245" w:lineRule="auto"/>
+      </w:pPr>
       <w:r>
         <w:rPr>
           <w:b/>
+          <w:sz w:val="17"/>
         </w:rPr>
         <w:t xml:space="preserve">Track End. </w:t>
       </w:r>
       <w:r>
+        <w:rPr>
+          <w:sz w:val="17"/>
+        </w:rPr>
         <w:t>End when either side has no units in play or at Turn 8.</w:t>
       </w:r>
     </w:p>
@@ -4280,57 +6050,92 @@
       </w:r>
     </w:p>
     <w:p>
+      <w:pPr>
+        <w:spacing w:after="50" w:line="245" w:lineRule="auto"/>
+      </w:pPr>
       <w:r>
         <w:rPr>
           <w:b/>
+          <w:sz w:val="17"/>
         </w:rPr>
         <w:t xml:space="preserve">Entry. </w:t>
       </w:r>
       <w:r>
+        <w:rPr>
+          <w:sz w:val="17"/>
+        </w:rPr>
         <w:t>The Defender retreats from the Attacker's home edge toward its own. The Attacker enters from that same edge on Turn 2.</w:t>
       </w:r>
     </w:p>
     <w:p>
+      <w:pPr>
+        <w:spacing w:after="50" w:line="245" w:lineRule="auto"/>
+      </w:pPr>
       <w:r>
         <w:rPr>
           <w:b/>
+          <w:sz w:val="17"/>
         </w:rPr>
         <w:t xml:space="preserve">Scan. </w:t>
       </w:r>
       <w:r>
+        <w:rPr>
+          <w:sz w:val="17"/>
+        </w:rPr>
         <w:t>Use a two-thirds scan threshold.</w:t>
       </w:r>
     </w:p>
     <w:p>
+      <w:pPr>
+        <w:spacing w:after="50" w:line="245" w:lineRule="auto"/>
+      </w:pPr>
       <w:r>
         <w:rPr>
           <w:b/>
+          <w:sz w:val="17"/>
         </w:rPr>
         <w:t xml:space="preserve">Hammer. </w:t>
       </w:r>
       <w:r>
+        <w:rPr>
+          <w:sz w:val="17"/>
+        </w:rPr>
         <w:t>The first side to reach 25% scores Hammer. If both reach it in the same End Phase, neither scores.</w:t>
       </w:r>
     </w:p>
     <w:p>
+      <w:pPr>
+        <w:spacing w:after="50" w:line="245" w:lineRule="auto"/>
+      </w:pPr>
       <w:r>
         <w:rPr>
           <w:b/>
+          <w:sz w:val="17"/>
         </w:rPr>
         <w:t xml:space="preserve">Gauntlet. </w:t>
       </w:r>
       <w:r>
+        <w:rPr>
+          <w:sz w:val="17"/>
+        </w:rPr>
         <w:t>Complete Gauntlet when half of the eligible force escapes; crippled units count.</w:t>
       </w:r>
     </w:p>
     <w:p>
+      <w:pPr>
+        <w:spacing w:after="50" w:line="245" w:lineRule="auto"/>
+      </w:pPr>
       <w:r>
         <w:rPr>
           <w:b/>
+          <w:sz w:val="17"/>
         </w:rPr>
         <w:t xml:space="preserve">Track End. </w:t>
       </w:r>
       <w:r>
+        <w:rPr>
+          <w:sz w:val="17"/>
+        </w:rPr>
         <w:t>End when either side has no units in play or at Turn 10.</w:t>
       </w:r>
     </w:p>
@@ -4343,46 +6148,74 @@
       </w:r>
     </w:p>
     <w:p>
+      <w:pPr>
+        <w:spacing w:after="50" w:line="245" w:lineRule="auto"/>
+      </w:pPr>
       <w:r>
         <w:rPr>
           <w:b/>
+          <w:sz w:val="17"/>
         </w:rPr>
         <w:t xml:space="preserve">Objectives. </w:t>
       </w:r>
       <w:r>
+        <w:rPr>
+          <w:sz w:val="17"/>
+        </w:rPr>
         <w:t>Retain the Tukayyid objectives.</w:t>
       </w:r>
     </w:p>
     <w:p>
+      <w:pPr>
+        <w:spacing w:after="50" w:line="245" w:lineRule="auto"/>
+      </w:pPr>
       <w:r>
         <w:rPr>
           <w:b/>
+          <w:sz w:val="17"/>
         </w:rPr>
         <w:t xml:space="preserve">Battlefield. </w:t>
       </w:r>
       <w:r>
+        <w:rPr>
+          <w:sz w:val="17"/>
+        </w:rPr>
         <w:t>Use the Draconis Reach building durability and deployment zones. Retain the Tukayyid fortress option.</w:t>
       </w:r>
     </w:p>
     <w:p>
+      <w:pPr>
+        <w:spacing w:after="50" w:line="245" w:lineRule="auto"/>
+      </w:pPr>
       <w:r>
         <w:rPr>
           <w:b/>
+          <w:sz w:val="17"/>
         </w:rPr>
         <w:t xml:space="preserve">Reinforcements. </w:t>
       </w:r>
       <w:r>
+        <w:rPr>
+          <w:sz w:val="17"/>
+        </w:rPr>
         <w:t>Replace the secret 1D6+1 arrival with guaranteed Turn 2 flank entry.</w:t>
       </w:r>
     </w:p>
     <w:p>
+      <w:pPr>
+        <w:spacing w:after="50" w:line="245" w:lineRule="auto"/>
+      </w:pPr>
       <w:r>
         <w:rPr>
           <w:b/>
+          <w:sz w:val="17"/>
         </w:rPr>
         <w:t xml:space="preserve">Track End. </w:t>
       </w:r>
       <w:r>
+        <w:rPr>
+          <w:sz w:val="17"/>
+        </w:rPr>
         <w:t>End when either side has no units in play or at Turn 10 (Turn 8 shortened).</w:t>
       </w:r>
     </w:p>
@@ -4395,90 +6228,146 @@
       </w:r>
     </w:p>
     <w:p>
+      <w:pPr>
+        <w:spacing w:after="50" w:line="245" w:lineRule="auto"/>
+      </w:pPr>
       <w:r>
         <w:rPr>
           <w:b/>
+          <w:sz w:val="17"/>
         </w:rPr>
         <w:t xml:space="preserve">Track. </w:t>
       </w:r>
       <w:r>
+        <w:rPr>
+          <w:sz w:val="17"/>
+        </w:rPr>
         <w:t>Retain the Tukayyid Supply Track. Do not add Objective Raid as a separate Track.</w:t>
       </w:r>
     </w:p>
     <w:p>
+      <w:pPr>
+        <w:spacing w:after="50" w:line="245" w:lineRule="auto"/>
+      </w:pPr>
       <w:r>
         <w:rPr>
           <w:b/>
+          <w:sz w:val="17"/>
         </w:rPr>
         <w:t xml:space="preserve">Warehouses. </w:t>
       </w:r>
       <w:r>
+        <w:rPr>
+          <w:sz w:val="17"/>
+        </w:rPr>
         <w:t>Place six buildings and secretly identify two as warehouses. A warehouse must be scanned before loading.</w:t>
       </w:r>
     </w:p>
     <w:p>
+      <w:pPr>
+        <w:spacing w:after="50" w:line="245" w:lineRule="auto"/>
+      </w:pPr>
       <w:r>
         <w:rPr>
           <w:b/>
+          <w:sz w:val="17"/>
         </w:rPr>
         <w:t xml:space="preserve">Components. </w:t>
       </w:r>
       <w:r>
+        <w:rPr>
+          <w:sz w:val="17"/>
+        </w:rPr>
         <w:t>Each warehouse holds one component per Campaign Scale, for a total of 2/4/6 components.</w:t>
       </w:r>
     </w:p>
     <w:p>
+      <w:pPr>
+        <w:spacing w:after="50" w:line="245" w:lineRule="auto"/>
+      </w:pPr>
       <w:r>
         <w:rPr>
           <w:b/>
+          <w:sz w:val="17"/>
         </w:rPr>
         <w:t xml:space="preserve">Handling. </w:t>
       </w:r>
       <w:r>
+        <w:rPr>
+          <w:sz w:val="17"/>
+        </w:rPr>
         <w:t>Use the Draconis Reach loading, carrying, transfer, and movement-penalty rules for components.</w:t>
       </w:r>
     </w:p>
     <w:p>
+      <w:pPr>
+        <w:spacing w:after="50" w:line="245" w:lineRule="auto"/>
+      </w:pPr>
       <w:r>
         <w:rPr>
           <w:b/>
+          <w:sz w:val="17"/>
         </w:rPr>
         <w:t xml:space="preserve">Objectives. </w:t>
       </w:r>
       <w:r>
+        <w:rPr>
+          <w:sz w:val="17"/>
+        </w:rPr>
         <w:t>Retain the Tukayyid casualty and survival objectives.</w:t>
       </w:r>
     </w:p>
     <w:p>
+      <w:pPr>
+        <w:spacing w:after="50" w:line="245" w:lineRule="auto"/>
+      </w:pPr>
       <w:r>
         <w:rPr>
           <w:b/>
+          <w:sz w:val="17"/>
         </w:rPr>
         <w:t xml:space="preserve">Delayed Group. </w:t>
       </w:r>
       <w:r>
+        <w:rPr>
+          <w:sz w:val="17"/>
+        </w:rPr>
         <w:t>The delayed group enters on Turn 6.</w:t>
       </w:r>
     </w:p>
     <w:p>
+      <w:pPr>
+        <w:spacing w:after="50" w:line="245" w:lineRule="auto"/>
+      </w:pPr>
       <w:r>
         <w:rPr>
           <w:b/>
+          <w:sz w:val="17"/>
         </w:rPr>
         <w:t xml:space="preserve">Track End. </w:t>
       </w:r>
       <w:r>
+        <w:rPr>
+          <w:sz w:val="17"/>
+        </w:rPr>
         <w:t>End when either side has no units in play or at Turn 10.</w:t>
       </w:r>
     </w:p>
     <w:p>
+      <w:pPr>
+        <w:spacing w:after="50" w:line="245" w:lineRule="auto"/>
+      </w:pPr>
       <w:r>
         <w:rPr>
           <w:b/>
+          <w:sz w:val="17"/>
         </w:rPr>
         <w:t xml:space="preserve">Campaign Reward. </w:t>
       </w:r>
       <w:r>
+        <w:rPr>
+          <w:sz w:val="17"/>
+        </w:rPr>
         <w:t>Each component carried off the Attacker's home edge awards the Attacker 500 SP. This reward is in addition to the Track's normal Support Allocation.</w:t>
       </w:r>
     </w:p>

</xml_diff>